<commit_message>
Update Word document (Analysis Report) Table 8 and Data Overview to match enhanced 32-item catalog
- Table 8 (Proposed Enhanced Catalog): rebuilt with all 32 items from CSV, 6 columns
- Table 0 (Data Overview): updated to show 32 items, 6 columns
- Section 7 intro text: updated to reflect 32 items across 8 categories

Agent-Logs-Url: https://github.com/SupportAshjar/training-survey-data/sessions/2b06358b-ce69-4106-88aa-70983af52854

Co-authored-by: SupportAshjar <269141587+SupportAshjar@users.noreply.github.com>
</commit_message>
<xml_diff>
--- a/OneHub_Service_Request_Incident_Analysis_Report.docx
+++ b/OneHub_Service_Request_Incident_Analysis_Report.docx
@@ -463,10 +463,7 @@
           </w:tcPr>
           <w:p>
             <w:r>
-              <w:rPr>
-                <w:sz w:val="18"/>
-              </w:rPr>
-              <w:t>8</w:t>
+              <w:t>32</w:t>
             </w:r>
           </w:p>
         </w:tc>
@@ -476,10 +473,7 @@
           </w:tcPr>
           <w:p>
             <w:r>
-              <w:rPr>
-                <w:sz w:val="18"/>
-              </w:rPr>
-              <w:t>5</w:t>
+              <w:t>6</w:t>
             </w:r>
           </w:p>
         </w:tc>
@@ -489,10 +483,7 @@
           </w:tcPr>
           <w:p>
             <w:r>
-              <w:rPr>
-                <w:sz w:val="18"/>
-              </w:rPr>
-              <w:t>Current catalog definition (8 items)</w:t>
+              <w:t>Enhanced catalog definition (32 items, 8 categories)</w:t>
             </w:r>
           </w:p>
         </w:tc>
@@ -6236,7 +6227,11 @@
     </w:p>
     <w:p>
       <w:r>
-        <w:t>Based on the analysis above, the following enhanced catalog structure is recommended. This replaces the current flat 8-item catalog with a hierarchical structure that reflects actual user demand patterns.</w:t>
+        <w:rPr>
+          <w:rFonts w:ascii="Calibri" w:hAnsi="Calibri"/>
+          <w:sz w:val="22"/>
+        </w:rPr>
+        <w:t>Based on the analysis above, the following enhanced catalog structure is recommended. This replaces the current flat 8-item catalog with a hierarchical structure of 32 items across 8 categories that reflects actual user demand patterns. All items now have SLA targets defined.</w:t>
       </w:r>
     </w:p>
     <w:tbl>
@@ -6247,24 +6242,24 @@
         <w:tblLook w:firstColumn="1" w:firstRow="1" w:lastColumn="0" w:lastRow="0" w:noHBand="0" w:noVBand="1" w:val="04A0"/>
       </w:tblPr>
       <w:tblGrid>
-        <w:gridCol w:w="1881"/>
-        <w:gridCol w:w="1881"/>
-        <w:gridCol w:w="1881"/>
-        <w:gridCol w:w="1881"/>
-        <w:gridCol w:w="1881"/>
+        <w:gridCol w:w="1568"/>
+        <w:gridCol w:w="1568"/>
+        <w:gridCol w:w="1568"/>
+        <w:gridCol w:w="1568"/>
+        <w:gridCol w:w="1568"/>
+        <w:gridCol w:w="1568"/>
       </w:tblGrid>
       <w:tr>
         <w:tc>
           <w:tcPr>
-            <w:tcW w:type="dxa" w:w="1881"/>
-            <w:shd w:fill="1F4E79" w:val="clear"/>
-          </w:tcPr>
-          <w:p>
-            <w:pPr>
-              <w:jc w:val="center"/>
-            </w:pPr>
-            <w:r>
-              <w:rPr>
+            <w:tcW w:type="dxa" w:w="1568"/>
+            <w:shd w:val="clear" w:color="auto" w:fill="4472C4"/>
+          </w:tcPr>
+          <w:p>
+            <w:r/>
+            <w:r>
+              <w:rPr>
+                <w:rFonts w:ascii="Calibri" w:hAnsi="Calibri"/>
                 <w:b/>
                 <w:color w:val="FFFFFF"/>
                 <w:sz w:val="18"/>
@@ -6275,76 +6270,90 @@
         </w:tc>
         <w:tc>
           <w:tcPr>
-            <w:tcW w:type="dxa" w:w="1881"/>
-            <w:shd w:fill="1F4E79" w:val="clear"/>
-          </w:tcPr>
-          <w:p>
-            <w:pPr>
-              <w:jc w:val="center"/>
-            </w:pPr>
-            <w:r>
-              <w:rPr>
+            <w:tcW w:type="dxa" w:w="1568"/>
+            <w:shd w:val="clear" w:color="auto" w:fill="4472C4"/>
+          </w:tcPr>
+          <w:p>
+            <w:r/>
+            <w:r>
+              <w:rPr>
+                <w:rFonts w:ascii="Calibri" w:hAnsi="Calibri"/>
                 <w:b/>
                 <w:color w:val="FFFFFF"/>
                 <w:sz w:val="18"/>
               </w:rPr>
-              <w:t>Category</w:t>
-            </w:r>
-          </w:p>
-        </w:tc>
-        <w:tc>
-          <w:tcPr>
-            <w:tcW w:type="dxa" w:w="1881"/>
-            <w:shd w:fill="1F4E79" w:val="clear"/>
-          </w:tcPr>
-          <w:p>
-            <w:pPr>
-              <w:jc w:val="center"/>
-            </w:pPr>
-            <w:r>
-              <w:rPr>
+              <w:t>Service Offering</w:t>
+            </w:r>
+          </w:p>
+        </w:tc>
+        <w:tc>
+          <w:tcPr>
+            <w:tcW w:type="dxa" w:w="1568"/>
+            <w:shd w:val="clear" w:color="auto" w:fill="4472C4"/>
+          </w:tcPr>
+          <w:p>
+            <w:r/>
+            <w:r>
+              <w:rPr>
+                <w:rFonts w:ascii="Calibri" w:hAnsi="Calibri"/>
                 <w:b/>
                 <w:color w:val="FFFFFF"/>
                 <w:sz w:val="18"/>
               </w:rPr>
-              <w:t>Sub-Category / Action</w:t>
-            </w:r>
-          </w:p>
-        </w:tc>
-        <w:tc>
-          <w:tcPr>
-            <w:tcW w:type="dxa" w:w="1881"/>
-            <w:shd w:fill="1F4E79" w:val="clear"/>
-          </w:tcPr>
-          <w:p>
-            <w:pPr>
-              <w:jc w:val="center"/>
-            </w:pPr>
-            <w:r>
-              <w:rPr>
+              <w:t>Category</w:t>
+            </w:r>
+          </w:p>
+        </w:tc>
+        <w:tc>
+          <w:tcPr>
+            <w:tcW w:type="dxa" w:w="1568"/>
+            <w:shd w:val="clear" w:color="auto" w:fill="4472C4"/>
+          </w:tcPr>
+          <w:p>
+            <w:r/>
+            <w:r>
+              <w:rPr>
+                <w:rFonts w:ascii="Calibri" w:hAnsi="Calibri"/>
                 <w:b/>
                 <w:color w:val="FFFFFF"/>
                 <w:sz w:val="18"/>
               </w:rPr>
-              <w:t>Proposed SLA</w:t>
-            </w:r>
-          </w:p>
-        </w:tc>
-        <w:tc>
-          <w:tcPr>
-            <w:tcW w:type="dxa" w:w="1881"/>
-            <w:shd w:fill="1F4E79" w:val="clear"/>
-          </w:tcPr>
-          <w:p>
-            <w:pPr>
-              <w:jc w:val="center"/>
-            </w:pPr>
-            <w:r>
-              <w:rPr>
+              <w:t>Action / Request Type</w:t>
+            </w:r>
+          </w:p>
+        </w:tc>
+        <w:tc>
+          <w:tcPr>
+            <w:tcW w:type="dxa" w:w="1568"/>
+            <w:shd w:val="clear" w:color="auto" w:fill="4472C4"/>
+          </w:tcPr>
+          <w:p>
+            <w:r/>
+            <w:r>
+              <w:rPr>
+                <w:rFonts w:ascii="Calibri" w:hAnsi="Calibri"/>
                 <w:b/>
                 <w:color w:val="FFFFFF"/>
                 <w:sz w:val="18"/>
               </w:rPr>
+              <w:t>SLA Duration</w:t>
+            </w:r>
+          </w:p>
+        </w:tc>
+        <w:tc>
+          <w:tcPr>
+            <w:tcW w:type="dxa" w:w="1568"/>
+            <w:shd w:val="clear" w:color="auto" w:fill="4472C4"/>
+          </w:tcPr>
+          <w:p>
+            <w:r/>
+            <w:r>
+              <w:rPr>
+                <w:rFonts w:ascii="Calibri" w:hAnsi="Calibri"/>
+                <w:b/>
+                <w:color w:val="FFFFFF"/>
+                <w:sz w:val="18"/>
+              </w:rPr>
               <w:t>Fulfilment Group</w:t>
             </w:r>
           </w:p>
@@ -6353,11 +6362,13 @@
       <w:tr>
         <w:tc>
           <w:tcPr>
-            <w:tcW w:type="dxa" w:w="1881"/>
-          </w:tcPr>
-          <w:p>
-            <w:r>
-              <w:rPr>
+            <w:tcW w:type="dxa" w:w="1568"/>
+          </w:tcPr>
+          <w:p>
+            <w:r/>
+            <w:r>
+              <w:rPr>
+                <w:rFonts w:ascii="Calibri" w:hAnsi="Calibri"/>
                 <w:sz w:val="18"/>
               </w:rPr>
               <w:t>OneHub Service</w:t>
@@ -6366,11 +6377,28 @@
         </w:tc>
         <w:tc>
           <w:tcPr>
-            <w:tcW w:type="dxa" w:w="1881"/>
-          </w:tcPr>
-          <w:p>
-            <w:r>
-              <w:rPr>
+            <w:tcW w:type="dxa" w:w="1568"/>
+          </w:tcPr>
+          <w:p>
+            <w:r/>
+            <w:r>
+              <w:rPr>
+                <w:rFonts w:ascii="Calibri" w:hAnsi="Calibri"/>
+                <w:sz w:val="18"/>
+              </w:rPr>
+              <w:t>OneHUB</w:t>
+            </w:r>
+          </w:p>
+        </w:tc>
+        <w:tc>
+          <w:tcPr>
+            <w:tcW w:type="dxa" w:w="1568"/>
+          </w:tcPr>
+          <w:p>
+            <w:r/>
+            <w:r>
+              <w:rPr>
+                <w:rFonts w:ascii="Calibri" w:hAnsi="Calibri"/>
                 <w:sz w:val="18"/>
               </w:rPr>
               <w:t>Access &amp; Authentication</w:t>
@@ -6379,11 +6407,13 @@
         </w:tc>
         <w:tc>
           <w:tcPr>
-            <w:tcW w:type="dxa" w:w="1881"/>
-          </w:tcPr>
-          <w:p>
-            <w:r>
-              <w:rPr>
+            <w:tcW w:type="dxa" w:w="1568"/>
+          </w:tcPr>
+          <w:p>
+            <w:r/>
+            <w:r>
+              <w:rPr>
+                <w:rFonts w:ascii="Calibri" w:hAnsi="Calibri"/>
                 <w:sz w:val="18"/>
               </w:rPr>
               <w:t>Login / Access Issue</w:t>
@@ -6392,24 +6422,28 @@
         </w:tc>
         <w:tc>
           <w:tcPr>
-            <w:tcW w:type="dxa" w:w="1881"/>
-          </w:tcPr>
-          <w:p>
-            <w:r>
-              <w:rPr>
-                <w:sz w:val="18"/>
-              </w:rPr>
-              <w:t>1 day</w:t>
-            </w:r>
-          </w:p>
-        </w:tc>
-        <w:tc>
-          <w:tcPr>
-            <w:tcW w:type="dxa" w:w="1881"/>
-          </w:tcPr>
-          <w:p>
-            <w:r>
-              <w:rPr>
+            <w:tcW w:type="dxa" w:w="1568"/>
+          </w:tcPr>
+          <w:p>
+            <w:r/>
+            <w:r>
+              <w:rPr>
+                <w:rFonts w:ascii="Calibri" w:hAnsi="Calibri"/>
+                <w:sz w:val="18"/>
+              </w:rPr>
+              <w:t>RITM Resolution SLA(1 days)</w:t>
+            </w:r>
+          </w:p>
+        </w:tc>
+        <w:tc>
+          <w:tcPr>
+            <w:tcW w:type="dxa" w:w="1568"/>
+          </w:tcPr>
+          <w:p>
+            <w:r/>
+            <w:r>
+              <w:rPr>
+                <w:rFonts w:ascii="Calibri" w:hAnsi="Calibri"/>
                 <w:sz w:val="18"/>
               </w:rPr>
               <w:t>DGE HQ IT CDP OneHub Support</w:t>
@@ -6420,12 +6454,14 @@
       <w:tr>
         <w:tc>
           <w:tcPr>
-            <w:tcW w:type="dxa" w:w="1881"/>
-            <w:shd w:fill="E8F0FE" w:val="clear"/>
-          </w:tcPr>
-          <w:p>
-            <w:r>
-              <w:rPr>
+            <w:tcW w:type="dxa" w:w="1568"/>
+            <w:shd w:val="clear" w:color="auto" w:fill="D9E2F3"/>
+          </w:tcPr>
+          <w:p>
+            <w:r/>
+            <w:r>
+              <w:rPr>
+                <w:rFonts w:ascii="Calibri" w:hAnsi="Calibri"/>
                 <w:sz w:val="18"/>
               </w:rPr>
               <w:t>OneHub Service</w:t>
@@ -6434,12 +6470,30 @@
         </w:tc>
         <w:tc>
           <w:tcPr>
-            <w:tcW w:type="dxa" w:w="1881"/>
-            <w:shd w:fill="E8F0FE" w:val="clear"/>
-          </w:tcPr>
-          <w:p>
-            <w:r>
-              <w:rPr>
+            <w:tcW w:type="dxa" w:w="1568"/>
+            <w:shd w:val="clear" w:color="auto" w:fill="D9E2F3"/>
+          </w:tcPr>
+          <w:p>
+            <w:r/>
+            <w:r>
+              <w:rPr>
+                <w:rFonts w:ascii="Calibri" w:hAnsi="Calibri"/>
+                <w:sz w:val="18"/>
+              </w:rPr>
+              <w:t>OneHUB</w:t>
+            </w:r>
+          </w:p>
+        </w:tc>
+        <w:tc>
+          <w:tcPr>
+            <w:tcW w:type="dxa" w:w="1568"/>
+            <w:shd w:val="clear" w:color="auto" w:fill="D9E2F3"/>
+          </w:tcPr>
+          <w:p>
+            <w:r/>
+            <w:r>
+              <w:rPr>
+                <w:rFonts w:ascii="Calibri" w:hAnsi="Calibri"/>
                 <w:sz w:val="18"/>
               </w:rPr>
               <w:t>Access &amp; Authentication</w:t>
@@ -6448,12 +6502,14 @@
         </w:tc>
         <w:tc>
           <w:tcPr>
-            <w:tcW w:type="dxa" w:w="1881"/>
-            <w:shd w:fill="E8F0FE" w:val="clear"/>
-          </w:tcPr>
-          <w:p>
-            <w:r>
-              <w:rPr>
+            <w:tcW w:type="dxa" w:w="1568"/>
+            <w:shd w:val="clear" w:color="auto" w:fill="D9E2F3"/>
+          </w:tcPr>
+          <w:p>
+            <w:r/>
+            <w:r>
+              <w:rPr>
+                <w:rFonts w:ascii="Calibri" w:hAnsi="Calibri"/>
                 <w:sz w:val="18"/>
               </w:rPr>
               <w:t>MFA Reset / Device Change</w:t>
@@ -6462,26 +6518,30 @@
         </w:tc>
         <w:tc>
           <w:tcPr>
-            <w:tcW w:type="dxa" w:w="1881"/>
-            <w:shd w:fill="E8F0FE" w:val="clear"/>
-          </w:tcPr>
-          <w:p>
-            <w:r>
-              <w:rPr>
-                <w:sz w:val="18"/>
-              </w:rPr>
-              <w:t>1 day</w:t>
-            </w:r>
-          </w:p>
-        </w:tc>
-        <w:tc>
-          <w:tcPr>
-            <w:tcW w:type="dxa" w:w="1881"/>
-            <w:shd w:fill="E8F0FE" w:val="clear"/>
-          </w:tcPr>
-          <w:p>
-            <w:r>
-              <w:rPr>
+            <w:tcW w:type="dxa" w:w="1568"/>
+            <w:shd w:val="clear" w:color="auto" w:fill="D9E2F3"/>
+          </w:tcPr>
+          <w:p>
+            <w:r/>
+            <w:r>
+              <w:rPr>
+                <w:rFonts w:ascii="Calibri" w:hAnsi="Calibri"/>
+                <w:sz w:val="18"/>
+              </w:rPr>
+              <w:t>RITM Resolution SLA(1 days)</w:t>
+            </w:r>
+          </w:p>
+        </w:tc>
+        <w:tc>
+          <w:tcPr>
+            <w:tcW w:type="dxa" w:w="1568"/>
+            <w:shd w:val="clear" w:color="auto" w:fill="D9E2F3"/>
+          </w:tcPr>
+          <w:p>
+            <w:r/>
+            <w:r>
+              <w:rPr>
+                <w:rFonts w:ascii="Calibri" w:hAnsi="Calibri"/>
                 <w:sz w:val="18"/>
               </w:rPr>
               <w:t>DGE HQ IT CDP OneHub Support</w:t>
@@ -6492,11 +6552,13 @@
       <w:tr>
         <w:tc>
           <w:tcPr>
-            <w:tcW w:type="dxa" w:w="1881"/>
-          </w:tcPr>
-          <w:p>
-            <w:r>
-              <w:rPr>
+            <w:tcW w:type="dxa" w:w="1568"/>
+          </w:tcPr>
+          <w:p>
+            <w:r/>
+            <w:r>
+              <w:rPr>
+                <w:rFonts w:ascii="Calibri" w:hAnsi="Calibri"/>
                 <w:sz w:val="18"/>
               </w:rPr>
               <w:t>OneHub Service</w:t>
@@ -6505,11 +6567,28 @@
         </w:tc>
         <w:tc>
           <w:tcPr>
-            <w:tcW w:type="dxa" w:w="1881"/>
-          </w:tcPr>
-          <w:p>
-            <w:r>
-              <w:rPr>
+            <w:tcW w:type="dxa" w:w="1568"/>
+          </w:tcPr>
+          <w:p>
+            <w:r/>
+            <w:r>
+              <w:rPr>
+                <w:rFonts w:ascii="Calibri" w:hAnsi="Calibri"/>
+                <w:sz w:val="18"/>
+              </w:rPr>
+              <w:t>OneHUB</w:t>
+            </w:r>
+          </w:p>
+        </w:tc>
+        <w:tc>
+          <w:tcPr>
+            <w:tcW w:type="dxa" w:w="1568"/>
+          </w:tcPr>
+          <w:p>
+            <w:r/>
+            <w:r>
+              <w:rPr>
+                <w:rFonts w:ascii="Calibri" w:hAnsi="Calibri"/>
                 <w:sz w:val="18"/>
               </w:rPr>
               <w:t>Access &amp; Authentication</w:t>
@@ -6518,11 +6597,13 @@
         </w:tc>
         <w:tc>
           <w:tcPr>
-            <w:tcW w:type="dxa" w:w="1881"/>
-          </w:tcPr>
-          <w:p>
-            <w:r>
-              <w:rPr>
+            <w:tcW w:type="dxa" w:w="1568"/>
+          </w:tcPr>
+          <w:p>
+            <w:r/>
+            <w:r>
+              <w:rPr>
+                <w:rFonts w:ascii="Calibri" w:hAnsi="Calibri"/>
                 <w:sz w:val="18"/>
               </w:rPr>
               <w:t>Incorrect Account Resolution</w:t>
@@ -6531,24 +6612,28 @@
         </w:tc>
         <w:tc>
           <w:tcPr>
-            <w:tcW w:type="dxa" w:w="1881"/>
-          </w:tcPr>
-          <w:p>
-            <w:r>
-              <w:rPr>
-                <w:sz w:val="18"/>
-              </w:rPr>
-              <w:t>2 days</w:t>
-            </w:r>
-          </w:p>
-        </w:tc>
-        <w:tc>
-          <w:tcPr>
-            <w:tcW w:type="dxa" w:w="1881"/>
-          </w:tcPr>
-          <w:p>
-            <w:r>
-              <w:rPr>
+            <w:tcW w:type="dxa" w:w="1568"/>
+          </w:tcPr>
+          <w:p>
+            <w:r/>
+            <w:r>
+              <w:rPr>
+                <w:rFonts w:ascii="Calibri" w:hAnsi="Calibri"/>
+                <w:sz w:val="18"/>
+              </w:rPr>
+              <w:t>RITM Resolution SLA(2 days)</w:t>
+            </w:r>
+          </w:p>
+        </w:tc>
+        <w:tc>
+          <w:tcPr>
+            <w:tcW w:type="dxa" w:w="1568"/>
+          </w:tcPr>
+          <w:p>
+            <w:r/>
+            <w:r>
+              <w:rPr>
+                <w:rFonts w:ascii="Calibri" w:hAnsi="Calibri"/>
                 <w:sz w:val="18"/>
               </w:rPr>
               <w:t>DGE HQ IT CDP OneHub Support</w:t>
@@ -6559,12 +6644,14 @@
       <w:tr>
         <w:tc>
           <w:tcPr>
-            <w:tcW w:type="dxa" w:w="1881"/>
-            <w:shd w:fill="E8F0FE" w:val="clear"/>
-          </w:tcPr>
-          <w:p>
-            <w:r>
-              <w:rPr>
+            <w:tcW w:type="dxa" w:w="1568"/>
+            <w:shd w:val="clear" w:color="auto" w:fill="D9E2F3"/>
+          </w:tcPr>
+          <w:p>
+            <w:r/>
+            <w:r>
+              <w:rPr>
+                <w:rFonts w:ascii="Calibri" w:hAnsi="Calibri"/>
                 <w:sz w:val="18"/>
               </w:rPr>
               <w:t>OneHub Service</w:t>
@@ -6573,12 +6660,30 @@
         </w:tc>
         <w:tc>
           <w:tcPr>
-            <w:tcW w:type="dxa" w:w="1881"/>
-            <w:shd w:fill="E8F0FE" w:val="clear"/>
-          </w:tcPr>
-          <w:p>
-            <w:r>
-              <w:rPr>
+            <w:tcW w:type="dxa" w:w="1568"/>
+            <w:shd w:val="clear" w:color="auto" w:fill="D9E2F3"/>
+          </w:tcPr>
+          <w:p>
+            <w:r/>
+            <w:r>
+              <w:rPr>
+                <w:rFonts w:ascii="Calibri" w:hAnsi="Calibri"/>
+                <w:sz w:val="18"/>
+              </w:rPr>
+              <w:t>OneHUB</w:t>
+            </w:r>
+          </w:p>
+        </w:tc>
+        <w:tc>
+          <w:tcPr>
+            <w:tcW w:type="dxa" w:w="1568"/>
+            <w:shd w:val="clear" w:color="auto" w:fill="D9E2F3"/>
+          </w:tcPr>
+          <w:p>
+            <w:r/>
+            <w:r>
+              <w:rPr>
+                <w:rFonts w:ascii="Calibri" w:hAnsi="Calibri"/>
                 <w:sz w:val="18"/>
               </w:rPr>
               <w:t>Access &amp; Authentication</w:t>
@@ -6587,12 +6692,14 @@
         </w:tc>
         <w:tc>
           <w:tcPr>
-            <w:tcW w:type="dxa" w:w="1881"/>
-            <w:shd w:fill="E8F0FE" w:val="clear"/>
-          </w:tcPr>
-          <w:p>
-            <w:r>
-              <w:rPr>
+            <w:tcW w:type="dxa" w:w="1568"/>
+            <w:shd w:val="clear" w:color="auto" w:fill="D9E2F3"/>
+          </w:tcPr>
+          <w:p>
+            <w:r/>
+            <w:r>
+              <w:rPr>
+                <w:rFonts w:ascii="Calibri" w:hAnsi="Calibri"/>
                 <w:sz w:val="18"/>
               </w:rPr>
               <w:t>New Account Activation</w:t>
@@ -6601,26 +6708,30 @@
         </w:tc>
         <w:tc>
           <w:tcPr>
-            <w:tcW w:type="dxa" w:w="1881"/>
-            <w:shd w:fill="E8F0FE" w:val="clear"/>
-          </w:tcPr>
-          <w:p>
-            <w:r>
-              <w:rPr>
-                <w:sz w:val="18"/>
-              </w:rPr>
-              <w:t>2 days</w:t>
-            </w:r>
-          </w:p>
-        </w:tc>
-        <w:tc>
-          <w:tcPr>
-            <w:tcW w:type="dxa" w:w="1881"/>
-            <w:shd w:fill="E8F0FE" w:val="clear"/>
-          </w:tcPr>
-          <w:p>
-            <w:r>
-              <w:rPr>
+            <w:tcW w:type="dxa" w:w="1568"/>
+            <w:shd w:val="clear" w:color="auto" w:fill="D9E2F3"/>
+          </w:tcPr>
+          <w:p>
+            <w:r/>
+            <w:r>
+              <w:rPr>
+                <w:rFonts w:ascii="Calibri" w:hAnsi="Calibri"/>
+                <w:sz w:val="18"/>
+              </w:rPr>
+              <w:t>RITM Resolution SLA(2 days)</w:t>
+            </w:r>
+          </w:p>
+        </w:tc>
+        <w:tc>
+          <w:tcPr>
+            <w:tcW w:type="dxa" w:w="1568"/>
+            <w:shd w:val="clear" w:color="auto" w:fill="D9E2F3"/>
+          </w:tcPr>
+          <w:p>
+            <w:r/>
+            <w:r>
+              <w:rPr>
+                <w:rFonts w:ascii="Calibri" w:hAnsi="Calibri"/>
                 <w:sz w:val="18"/>
               </w:rPr>
               <w:t>DGE HQ IT CDP OneHub Support</w:t>
@@ -6631,11 +6742,13 @@
       <w:tr>
         <w:tc>
           <w:tcPr>
-            <w:tcW w:type="dxa" w:w="1881"/>
-          </w:tcPr>
-          <w:p>
-            <w:r>
-              <w:rPr>
+            <w:tcW w:type="dxa" w:w="1568"/>
+          </w:tcPr>
+          <w:p>
+            <w:r/>
+            <w:r>
+              <w:rPr>
+                <w:rFonts w:ascii="Calibri" w:hAnsi="Calibri"/>
                 <w:sz w:val="18"/>
               </w:rPr>
               <w:t>OneHub Service</w:t>
@@ -6644,24 +6757,43 @@
         </w:tc>
         <w:tc>
           <w:tcPr>
-            <w:tcW w:type="dxa" w:w="1881"/>
-          </w:tcPr>
-          <w:p>
-            <w:r>
-              <w:rPr>
-                <w:sz w:val="18"/>
-              </w:rPr>
-              <w:t>Attendance &amp; Time Mgmt</w:t>
-            </w:r>
-          </w:p>
-        </w:tc>
-        <w:tc>
-          <w:tcPr>
-            <w:tcW w:type="dxa" w:w="1881"/>
-          </w:tcPr>
-          <w:p>
-            <w:r>
-              <w:rPr>
+            <w:tcW w:type="dxa" w:w="1568"/>
+          </w:tcPr>
+          <w:p>
+            <w:r/>
+            <w:r>
+              <w:rPr>
+                <w:rFonts w:ascii="Calibri" w:hAnsi="Calibri"/>
+                <w:sz w:val="18"/>
+              </w:rPr>
+              <w:t>OneHUB</w:t>
+            </w:r>
+          </w:p>
+        </w:tc>
+        <w:tc>
+          <w:tcPr>
+            <w:tcW w:type="dxa" w:w="1568"/>
+          </w:tcPr>
+          <w:p>
+            <w:r/>
+            <w:r>
+              <w:rPr>
+                <w:rFonts w:ascii="Calibri" w:hAnsi="Calibri"/>
+                <w:sz w:val="18"/>
+              </w:rPr>
+              <w:t>Attendance &amp; Time Management</w:t>
+            </w:r>
+          </w:p>
+        </w:tc>
+        <w:tc>
+          <w:tcPr>
+            <w:tcW w:type="dxa" w:w="1568"/>
+          </w:tcPr>
+          <w:p>
+            <w:r/>
+            <w:r>
+              <w:rPr>
+                <w:rFonts w:ascii="Calibri" w:hAnsi="Calibri"/>
                 <w:sz w:val="18"/>
               </w:rPr>
               <w:t>Attendance Violation Query</w:t>
@@ -6670,24 +6802,28 @@
         </w:tc>
         <w:tc>
           <w:tcPr>
-            <w:tcW w:type="dxa" w:w="1881"/>
-          </w:tcPr>
-          <w:p>
-            <w:r>
-              <w:rPr>
-                <w:sz w:val="18"/>
-              </w:rPr>
-              <w:t>1 day</w:t>
-            </w:r>
-          </w:p>
-        </w:tc>
-        <w:tc>
-          <w:tcPr>
-            <w:tcW w:type="dxa" w:w="1881"/>
-          </w:tcPr>
-          <w:p>
-            <w:r>
-              <w:rPr>
+            <w:tcW w:type="dxa" w:w="1568"/>
+          </w:tcPr>
+          <w:p>
+            <w:r/>
+            <w:r>
+              <w:rPr>
+                <w:rFonts w:ascii="Calibri" w:hAnsi="Calibri"/>
+                <w:sz w:val="18"/>
+              </w:rPr>
+              <w:t>RITM Resolution SLA(1 days)</w:t>
+            </w:r>
+          </w:p>
+        </w:tc>
+        <w:tc>
+          <w:tcPr>
+            <w:tcW w:type="dxa" w:w="1568"/>
+          </w:tcPr>
+          <w:p>
+            <w:r/>
+            <w:r>
+              <w:rPr>
+                <w:rFonts w:ascii="Calibri" w:hAnsi="Calibri"/>
                 <w:sz w:val="18"/>
               </w:rPr>
               <w:t>DGE HQ IT CDP OneHub Support</w:t>
@@ -6698,12 +6834,14 @@
       <w:tr>
         <w:tc>
           <w:tcPr>
-            <w:tcW w:type="dxa" w:w="1881"/>
-            <w:shd w:fill="E8F0FE" w:val="clear"/>
-          </w:tcPr>
-          <w:p>
-            <w:r>
-              <w:rPr>
+            <w:tcW w:type="dxa" w:w="1568"/>
+            <w:shd w:val="clear" w:color="auto" w:fill="D9E2F3"/>
+          </w:tcPr>
+          <w:p>
+            <w:r/>
+            <w:r>
+              <w:rPr>
+                <w:rFonts w:ascii="Calibri" w:hAnsi="Calibri"/>
                 <w:sz w:val="18"/>
               </w:rPr>
               <w:t>OneHub Service</w:t>
@@ -6712,26 +6850,46 @@
         </w:tc>
         <w:tc>
           <w:tcPr>
-            <w:tcW w:type="dxa" w:w="1881"/>
-            <w:shd w:fill="E8F0FE" w:val="clear"/>
-          </w:tcPr>
-          <w:p>
-            <w:r>
-              <w:rPr>
-                <w:sz w:val="18"/>
-              </w:rPr>
-              <w:t>Attendance &amp; Time Mgmt</w:t>
-            </w:r>
-          </w:p>
-        </w:tc>
-        <w:tc>
-          <w:tcPr>
-            <w:tcW w:type="dxa" w:w="1881"/>
-            <w:shd w:fill="E8F0FE" w:val="clear"/>
-          </w:tcPr>
-          <w:p>
-            <w:r>
-              <w:rPr>
+            <w:tcW w:type="dxa" w:w="1568"/>
+            <w:shd w:val="clear" w:color="auto" w:fill="D9E2F3"/>
+          </w:tcPr>
+          <w:p>
+            <w:r/>
+            <w:r>
+              <w:rPr>
+                <w:rFonts w:ascii="Calibri" w:hAnsi="Calibri"/>
+                <w:sz w:val="18"/>
+              </w:rPr>
+              <w:t>OneHUB</w:t>
+            </w:r>
+          </w:p>
+        </w:tc>
+        <w:tc>
+          <w:tcPr>
+            <w:tcW w:type="dxa" w:w="1568"/>
+            <w:shd w:val="clear" w:color="auto" w:fill="D9E2F3"/>
+          </w:tcPr>
+          <w:p>
+            <w:r/>
+            <w:r>
+              <w:rPr>
+                <w:rFonts w:ascii="Calibri" w:hAnsi="Calibri"/>
+                <w:sz w:val="18"/>
+              </w:rPr>
+              <w:t>Attendance &amp; Time Management</w:t>
+            </w:r>
+          </w:p>
+        </w:tc>
+        <w:tc>
+          <w:tcPr>
+            <w:tcW w:type="dxa" w:w="1568"/>
+            <w:shd w:val="clear" w:color="auto" w:fill="D9E2F3"/>
+          </w:tcPr>
+          <w:p>
+            <w:r/>
+            <w:r>
+              <w:rPr>
+                <w:rFonts w:ascii="Calibri" w:hAnsi="Calibri"/>
                 <w:sz w:val="18"/>
               </w:rPr>
               <w:t>Missing Swipe Regularization</w:t>
@@ -6740,26 +6898,30 @@
         </w:tc>
         <w:tc>
           <w:tcPr>
-            <w:tcW w:type="dxa" w:w="1881"/>
-            <w:shd w:fill="E8F0FE" w:val="clear"/>
-          </w:tcPr>
-          <w:p>
-            <w:r>
-              <w:rPr>
-                <w:sz w:val="18"/>
-              </w:rPr>
-              <w:t>1 day</w:t>
-            </w:r>
-          </w:p>
-        </w:tc>
-        <w:tc>
-          <w:tcPr>
-            <w:tcW w:type="dxa" w:w="1881"/>
-            <w:shd w:fill="E8F0FE" w:val="clear"/>
-          </w:tcPr>
-          <w:p>
-            <w:r>
-              <w:rPr>
+            <w:tcW w:type="dxa" w:w="1568"/>
+            <w:shd w:val="clear" w:color="auto" w:fill="D9E2F3"/>
+          </w:tcPr>
+          <w:p>
+            <w:r/>
+            <w:r>
+              <w:rPr>
+                <w:rFonts w:ascii="Calibri" w:hAnsi="Calibri"/>
+                <w:sz w:val="18"/>
+              </w:rPr>
+              <w:t>RITM Resolution SLA(1 days)</w:t>
+            </w:r>
+          </w:p>
+        </w:tc>
+        <w:tc>
+          <w:tcPr>
+            <w:tcW w:type="dxa" w:w="1568"/>
+            <w:shd w:val="clear" w:color="auto" w:fill="D9E2F3"/>
+          </w:tcPr>
+          <w:p>
+            <w:r/>
+            <w:r>
+              <w:rPr>
+                <w:rFonts w:ascii="Calibri" w:hAnsi="Calibri"/>
                 <w:sz w:val="18"/>
               </w:rPr>
               <w:t>DGE HQ IT CDP OneHub Support</w:t>
@@ -6770,11 +6932,13 @@
       <w:tr>
         <w:tc>
           <w:tcPr>
-            <w:tcW w:type="dxa" w:w="1881"/>
-          </w:tcPr>
-          <w:p>
-            <w:r>
-              <w:rPr>
+            <w:tcW w:type="dxa" w:w="1568"/>
+          </w:tcPr>
+          <w:p>
+            <w:r/>
+            <w:r>
+              <w:rPr>
+                <w:rFonts w:ascii="Calibri" w:hAnsi="Calibri"/>
                 <w:sz w:val="18"/>
               </w:rPr>
               <w:t>OneHub Service</w:t>
@@ -6783,50 +6947,73 @@
         </w:tc>
         <w:tc>
           <w:tcPr>
-            <w:tcW w:type="dxa" w:w="1881"/>
-          </w:tcPr>
-          <w:p>
-            <w:r>
-              <w:rPr>
-                <w:sz w:val="18"/>
-              </w:rPr>
-              <w:t>Attendance &amp; Time Mgmt</w:t>
-            </w:r>
-          </w:p>
-        </w:tc>
-        <w:tc>
-          <w:tcPr>
-            <w:tcW w:type="dxa" w:w="1881"/>
-          </w:tcPr>
-          <w:p>
-            <w:r>
-              <w:rPr>
-                <w:sz w:val="18"/>
-              </w:rPr>
-              <w:t>Time Attendance Report</w:t>
-            </w:r>
-          </w:p>
-        </w:tc>
-        <w:tc>
-          <w:tcPr>
-            <w:tcW w:type="dxa" w:w="1881"/>
-          </w:tcPr>
-          <w:p>
-            <w:r>
-              <w:rPr>
-                <w:sz w:val="18"/>
-              </w:rPr>
-              <w:t>2 days</w:t>
-            </w:r>
-          </w:p>
-        </w:tc>
-        <w:tc>
-          <w:tcPr>
-            <w:tcW w:type="dxa" w:w="1881"/>
-          </w:tcPr>
-          <w:p>
-            <w:r>
-              <w:rPr>
+            <w:tcW w:type="dxa" w:w="1568"/>
+          </w:tcPr>
+          <w:p>
+            <w:r/>
+            <w:r>
+              <w:rPr>
+                <w:rFonts w:ascii="Calibri" w:hAnsi="Calibri"/>
+                <w:sz w:val="18"/>
+              </w:rPr>
+              <w:t>OneHUB</w:t>
+            </w:r>
+          </w:p>
+        </w:tc>
+        <w:tc>
+          <w:tcPr>
+            <w:tcW w:type="dxa" w:w="1568"/>
+          </w:tcPr>
+          <w:p>
+            <w:r/>
+            <w:r>
+              <w:rPr>
+                <w:rFonts w:ascii="Calibri" w:hAnsi="Calibri"/>
+                <w:sz w:val="18"/>
+              </w:rPr>
+              <w:t>Attendance &amp; Time Management</w:t>
+            </w:r>
+          </w:p>
+        </w:tc>
+        <w:tc>
+          <w:tcPr>
+            <w:tcW w:type="dxa" w:w="1568"/>
+          </w:tcPr>
+          <w:p>
+            <w:r/>
+            <w:r>
+              <w:rPr>
+                <w:rFonts w:ascii="Calibri" w:hAnsi="Calibri"/>
+                <w:sz w:val="18"/>
+              </w:rPr>
+              <w:t>Check-In / Drive Safely Issue</w:t>
+            </w:r>
+          </w:p>
+        </w:tc>
+        <w:tc>
+          <w:tcPr>
+            <w:tcW w:type="dxa" w:w="1568"/>
+          </w:tcPr>
+          <w:p>
+            <w:r/>
+            <w:r>
+              <w:rPr>
+                <w:rFonts w:ascii="Calibri" w:hAnsi="Calibri"/>
+                <w:sz w:val="18"/>
+              </w:rPr>
+              <w:t>RITM Resolution SLA(1 days)</w:t>
+            </w:r>
+          </w:p>
+        </w:tc>
+        <w:tc>
+          <w:tcPr>
+            <w:tcW w:type="dxa" w:w="1568"/>
+          </w:tcPr>
+          <w:p>
+            <w:r/>
+            <w:r>
+              <w:rPr>
+                <w:rFonts w:ascii="Calibri" w:hAnsi="Calibri"/>
                 <w:sz w:val="18"/>
               </w:rPr>
               <w:t>DGE HQ IT CDP OneHub Support</w:t>
@@ -6837,12 +7024,14 @@
       <w:tr>
         <w:tc>
           <w:tcPr>
-            <w:tcW w:type="dxa" w:w="1881"/>
-            <w:shd w:fill="E8F0FE" w:val="clear"/>
-          </w:tcPr>
-          <w:p>
-            <w:r>
-              <w:rPr>
+            <w:tcW w:type="dxa" w:w="1568"/>
+            <w:shd w:val="clear" w:color="auto" w:fill="D9E2F3"/>
+          </w:tcPr>
+          <w:p>
+            <w:r/>
+            <w:r>
+              <w:rPr>
+                <w:rFonts w:ascii="Calibri" w:hAnsi="Calibri"/>
                 <w:sz w:val="18"/>
               </w:rPr>
               <w:t>OneHub Service</w:t>
@@ -6851,54 +7040,78 @@
         </w:tc>
         <w:tc>
           <w:tcPr>
-            <w:tcW w:type="dxa" w:w="1881"/>
-            <w:shd w:fill="E8F0FE" w:val="clear"/>
-          </w:tcPr>
-          <w:p>
-            <w:r>
-              <w:rPr>
-                <w:sz w:val="18"/>
-              </w:rPr>
-              <w:t>Leave &amp; Permissions</w:t>
-            </w:r>
-          </w:p>
-        </w:tc>
-        <w:tc>
-          <w:tcPr>
-            <w:tcW w:type="dxa" w:w="1881"/>
-            <w:shd w:fill="E8F0FE" w:val="clear"/>
-          </w:tcPr>
-          <w:p>
-            <w:r>
-              <w:rPr>
-                <w:sz w:val="18"/>
-              </w:rPr>
-              <w:t>Leave Request Issue</w:t>
-            </w:r>
-          </w:p>
-        </w:tc>
-        <w:tc>
-          <w:tcPr>
-            <w:tcW w:type="dxa" w:w="1881"/>
-            <w:shd w:fill="E8F0FE" w:val="clear"/>
-          </w:tcPr>
-          <w:p>
-            <w:r>
-              <w:rPr>
-                <w:sz w:val="18"/>
-              </w:rPr>
-              <w:t>1 day</w:t>
-            </w:r>
-          </w:p>
-        </w:tc>
-        <w:tc>
-          <w:tcPr>
-            <w:tcW w:type="dxa" w:w="1881"/>
-            <w:shd w:fill="E8F0FE" w:val="clear"/>
-          </w:tcPr>
-          <w:p>
-            <w:r>
-              <w:rPr>
+            <w:tcW w:type="dxa" w:w="1568"/>
+            <w:shd w:val="clear" w:color="auto" w:fill="D9E2F3"/>
+          </w:tcPr>
+          <w:p>
+            <w:r/>
+            <w:r>
+              <w:rPr>
+                <w:rFonts w:ascii="Calibri" w:hAnsi="Calibri"/>
+                <w:sz w:val="18"/>
+              </w:rPr>
+              <w:t>OneHUB</w:t>
+            </w:r>
+          </w:p>
+        </w:tc>
+        <w:tc>
+          <w:tcPr>
+            <w:tcW w:type="dxa" w:w="1568"/>
+            <w:shd w:val="clear" w:color="auto" w:fill="D9E2F3"/>
+          </w:tcPr>
+          <w:p>
+            <w:r/>
+            <w:r>
+              <w:rPr>
+                <w:rFonts w:ascii="Calibri" w:hAnsi="Calibri"/>
+                <w:sz w:val="18"/>
+              </w:rPr>
+              <w:t>Attendance &amp; Time Management</w:t>
+            </w:r>
+          </w:p>
+        </w:tc>
+        <w:tc>
+          <w:tcPr>
+            <w:tcW w:type="dxa" w:w="1568"/>
+            <w:shd w:val="clear" w:color="auto" w:fill="D9E2F3"/>
+          </w:tcPr>
+          <w:p>
+            <w:r/>
+            <w:r>
+              <w:rPr>
+                <w:rFonts w:ascii="Calibri" w:hAnsi="Calibri"/>
+                <w:sz w:val="18"/>
+              </w:rPr>
+              <w:t>Time Attendance Report Request</w:t>
+            </w:r>
+          </w:p>
+        </w:tc>
+        <w:tc>
+          <w:tcPr>
+            <w:tcW w:type="dxa" w:w="1568"/>
+            <w:shd w:val="clear" w:color="auto" w:fill="D9E2F3"/>
+          </w:tcPr>
+          <w:p>
+            <w:r/>
+            <w:r>
+              <w:rPr>
+                <w:rFonts w:ascii="Calibri" w:hAnsi="Calibri"/>
+                <w:sz w:val="18"/>
+              </w:rPr>
+              <w:t>RITM Resolution SLA(2 days)</w:t>
+            </w:r>
+          </w:p>
+        </w:tc>
+        <w:tc>
+          <w:tcPr>
+            <w:tcW w:type="dxa" w:w="1568"/>
+            <w:shd w:val="clear" w:color="auto" w:fill="D9E2F3"/>
+          </w:tcPr>
+          <w:p>
+            <w:r/>
+            <w:r>
+              <w:rPr>
+                <w:rFonts w:ascii="Calibri" w:hAnsi="Calibri"/>
                 <w:sz w:val="18"/>
               </w:rPr>
               <w:t>DGE HQ IT CDP OneHub Support</w:t>
@@ -6909,11 +7122,13 @@
       <w:tr>
         <w:tc>
           <w:tcPr>
-            <w:tcW w:type="dxa" w:w="1881"/>
-          </w:tcPr>
-          <w:p>
-            <w:r>
-              <w:rPr>
+            <w:tcW w:type="dxa" w:w="1568"/>
+          </w:tcPr>
+          <w:p>
+            <w:r/>
+            <w:r>
+              <w:rPr>
+                <w:rFonts w:ascii="Calibri" w:hAnsi="Calibri"/>
                 <w:sz w:val="18"/>
               </w:rPr>
               <w:t>OneHub Service</w:t>
@@ -6922,11 +7137,28 @@
         </w:tc>
         <w:tc>
           <w:tcPr>
-            <w:tcW w:type="dxa" w:w="1881"/>
-          </w:tcPr>
-          <w:p>
-            <w:r>
-              <w:rPr>
+            <w:tcW w:type="dxa" w:w="1568"/>
+          </w:tcPr>
+          <w:p>
+            <w:r/>
+            <w:r>
+              <w:rPr>
+                <w:rFonts w:ascii="Calibri" w:hAnsi="Calibri"/>
+                <w:sz w:val="18"/>
+              </w:rPr>
+              <w:t>OneHUB</w:t>
+            </w:r>
+          </w:p>
+        </w:tc>
+        <w:tc>
+          <w:tcPr>
+            <w:tcW w:type="dxa" w:w="1568"/>
+          </w:tcPr>
+          <w:p>
+            <w:r/>
+            <w:r>
+              <w:rPr>
+                <w:rFonts w:ascii="Calibri" w:hAnsi="Calibri"/>
                 <w:sz w:val="18"/>
               </w:rPr>
               <w:t>Leave &amp; Permissions</w:t>
@@ -6935,37 +7167,43 @@
         </w:tc>
         <w:tc>
           <w:tcPr>
-            <w:tcW w:type="dxa" w:w="1881"/>
-          </w:tcPr>
-          <w:p>
-            <w:r>
-              <w:rPr>
-                <w:sz w:val="18"/>
-              </w:rPr>
-              <w:t>Remote Work / Permission</w:t>
-            </w:r>
-          </w:p>
-        </w:tc>
-        <w:tc>
-          <w:tcPr>
-            <w:tcW w:type="dxa" w:w="1881"/>
-          </w:tcPr>
-          <w:p>
-            <w:r>
-              <w:rPr>
-                <w:sz w:val="18"/>
-              </w:rPr>
-              <w:t>1 day</w:t>
-            </w:r>
-          </w:p>
-        </w:tc>
-        <w:tc>
-          <w:tcPr>
-            <w:tcW w:type="dxa" w:w="1881"/>
-          </w:tcPr>
-          <w:p>
-            <w:r>
-              <w:rPr>
+            <w:tcW w:type="dxa" w:w="1568"/>
+          </w:tcPr>
+          <w:p>
+            <w:r/>
+            <w:r>
+              <w:rPr>
+                <w:rFonts w:ascii="Calibri" w:hAnsi="Calibri"/>
+                <w:sz w:val="18"/>
+              </w:rPr>
+              <w:t>Leave Request Issue</w:t>
+            </w:r>
+          </w:p>
+        </w:tc>
+        <w:tc>
+          <w:tcPr>
+            <w:tcW w:type="dxa" w:w="1568"/>
+          </w:tcPr>
+          <w:p>
+            <w:r/>
+            <w:r>
+              <w:rPr>
+                <w:rFonts w:ascii="Calibri" w:hAnsi="Calibri"/>
+                <w:sz w:val="18"/>
+              </w:rPr>
+              <w:t>RITM Resolution SLA(1 days)</w:t>
+            </w:r>
+          </w:p>
+        </w:tc>
+        <w:tc>
+          <w:tcPr>
+            <w:tcW w:type="dxa" w:w="1568"/>
+          </w:tcPr>
+          <w:p>
+            <w:r/>
+            <w:r>
+              <w:rPr>
+                <w:rFonts w:ascii="Calibri" w:hAnsi="Calibri"/>
                 <w:sz w:val="18"/>
               </w:rPr>
               <w:t>DGE HQ IT CDP OneHub Support</w:t>
@@ -6976,12 +7214,14 @@
       <w:tr>
         <w:tc>
           <w:tcPr>
-            <w:tcW w:type="dxa" w:w="1881"/>
-            <w:shd w:fill="E8F0FE" w:val="clear"/>
-          </w:tcPr>
-          <w:p>
-            <w:r>
-              <w:rPr>
+            <w:tcW w:type="dxa" w:w="1568"/>
+            <w:shd w:val="clear" w:color="auto" w:fill="D9E2F3"/>
+          </w:tcPr>
+          <w:p>
+            <w:r/>
+            <w:r>
+              <w:rPr>
+                <w:rFonts w:ascii="Calibri" w:hAnsi="Calibri"/>
                 <w:sz w:val="18"/>
               </w:rPr>
               <w:t>OneHub Service</w:t>
@@ -6990,12 +7230,30 @@
         </w:tc>
         <w:tc>
           <w:tcPr>
-            <w:tcW w:type="dxa" w:w="1881"/>
-            <w:shd w:fill="E8F0FE" w:val="clear"/>
-          </w:tcPr>
-          <w:p>
-            <w:r>
-              <w:rPr>
+            <w:tcW w:type="dxa" w:w="1568"/>
+            <w:shd w:val="clear" w:color="auto" w:fill="D9E2F3"/>
+          </w:tcPr>
+          <w:p>
+            <w:r/>
+            <w:r>
+              <w:rPr>
+                <w:rFonts w:ascii="Calibri" w:hAnsi="Calibri"/>
+                <w:sz w:val="18"/>
+              </w:rPr>
+              <w:t>OneHUB</w:t>
+            </w:r>
+          </w:p>
+        </w:tc>
+        <w:tc>
+          <w:tcPr>
+            <w:tcW w:type="dxa" w:w="1568"/>
+            <w:shd w:val="clear" w:color="auto" w:fill="D9E2F3"/>
+          </w:tcPr>
+          <w:p>
+            <w:r/>
+            <w:r>
+              <w:rPr>
+                <w:rFonts w:ascii="Calibri" w:hAnsi="Calibri"/>
                 <w:sz w:val="18"/>
               </w:rPr>
               <w:t>Leave &amp; Permissions</w:t>
@@ -7004,40 +7262,46 @@
         </w:tc>
         <w:tc>
           <w:tcPr>
-            <w:tcW w:type="dxa" w:w="1881"/>
-            <w:shd w:fill="E8F0FE" w:val="clear"/>
-          </w:tcPr>
-          <w:p>
-            <w:r>
-              <w:rPr>
-                <w:sz w:val="18"/>
-              </w:rPr>
-              <w:t>Approval Workflow Issue</w:t>
-            </w:r>
-          </w:p>
-        </w:tc>
-        <w:tc>
-          <w:tcPr>
-            <w:tcW w:type="dxa" w:w="1881"/>
-            <w:shd w:fill="E8F0FE" w:val="clear"/>
-          </w:tcPr>
-          <w:p>
-            <w:r>
-              <w:rPr>
-                <w:sz w:val="18"/>
-              </w:rPr>
-              <w:t>1 day</w:t>
-            </w:r>
-          </w:p>
-        </w:tc>
-        <w:tc>
-          <w:tcPr>
-            <w:tcW w:type="dxa" w:w="1881"/>
-            <w:shd w:fill="E8F0FE" w:val="clear"/>
-          </w:tcPr>
-          <w:p>
-            <w:r>
-              <w:rPr>
+            <w:tcW w:type="dxa" w:w="1568"/>
+            <w:shd w:val="clear" w:color="auto" w:fill="D9E2F3"/>
+          </w:tcPr>
+          <w:p>
+            <w:r/>
+            <w:r>
+              <w:rPr>
+                <w:rFonts w:ascii="Calibri" w:hAnsi="Calibri"/>
+                <w:sz w:val="18"/>
+              </w:rPr>
+              <w:t>Remote Work / Permission Request</w:t>
+            </w:r>
+          </w:p>
+        </w:tc>
+        <w:tc>
+          <w:tcPr>
+            <w:tcW w:type="dxa" w:w="1568"/>
+            <w:shd w:val="clear" w:color="auto" w:fill="D9E2F3"/>
+          </w:tcPr>
+          <w:p>
+            <w:r/>
+            <w:r>
+              <w:rPr>
+                <w:rFonts w:ascii="Calibri" w:hAnsi="Calibri"/>
+                <w:sz w:val="18"/>
+              </w:rPr>
+              <w:t>RITM Resolution SLA(1 days)</w:t>
+            </w:r>
+          </w:p>
+        </w:tc>
+        <w:tc>
+          <w:tcPr>
+            <w:tcW w:type="dxa" w:w="1568"/>
+            <w:shd w:val="clear" w:color="auto" w:fill="D9E2F3"/>
+          </w:tcPr>
+          <w:p>
+            <w:r/>
+            <w:r>
+              <w:rPr>
+                <w:rFonts w:ascii="Calibri" w:hAnsi="Calibri"/>
                 <w:sz w:val="18"/>
               </w:rPr>
               <w:t>DGE HQ IT CDP OneHub Support</w:t>
@@ -7048,11 +7312,13 @@
       <w:tr>
         <w:tc>
           <w:tcPr>
-            <w:tcW w:type="dxa" w:w="1881"/>
-          </w:tcPr>
-          <w:p>
-            <w:r>
-              <w:rPr>
+            <w:tcW w:type="dxa" w:w="1568"/>
+          </w:tcPr>
+          <w:p>
+            <w:r/>
+            <w:r>
+              <w:rPr>
+                <w:rFonts w:ascii="Calibri" w:hAnsi="Calibri"/>
                 <w:sz w:val="18"/>
               </w:rPr>
               <w:t>OneHub Service</w:t>
@@ -7061,50 +7327,73 @@
         </w:tc>
         <w:tc>
           <w:tcPr>
-            <w:tcW w:type="dxa" w:w="1881"/>
-          </w:tcPr>
-          <w:p>
-            <w:r>
-              <w:rPr>
-                <w:sz w:val="18"/>
-              </w:rPr>
-              <w:t>HR &amp; Employee Services</w:t>
-            </w:r>
-          </w:p>
-        </w:tc>
-        <w:tc>
-          <w:tcPr>
-            <w:tcW w:type="dxa" w:w="1881"/>
-          </w:tcPr>
-          <w:p>
-            <w:r>
-              <w:rPr>
-                <w:sz w:val="18"/>
-              </w:rPr>
-              <w:t>Salary / Employment Certificate</w:t>
-            </w:r>
-          </w:p>
-        </w:tc>
-        <w:tc>
-          <w:tcPr>
-            <w:tcW w:type="dxa" w:w="1881"/>
-          </w:tcPr>
-          <w:p>
-            <w:r>
-              <w:rPr>
-                <w:sz w:val="18"/>
-              </w:rPr>
-              <w:t>2 days</w:t>
-            </w:r>
-          </w:p>
-        </w:tc>
-        <w:tc>
-          <w:tcPr>
-            <w:tcW w:type="dxa" w:w="1881"/>
-          </w:tcPr>
-          <w:p>
-            <w:r>
-              <w:rPr>
+            <w:tcW w:type="dxa" w:w="1568"/>
+          </w:tcPr>
+          <w:p>
+            <w:r/>
+            <w:r>
+              <w:rPr>
+                <w:rFonts w:ascii="Calibri" w:hAnsi="Calibri"/>
+                <w:sz w:val="18"/>
+              </w:rPr>
+              <w:t>OneHUB</w:t>
+            </w:r>
+          </w:p>
+        </w:tc>
+        <w:tc>
+          <w:tcPr>
+            <w:tcW w:type="dxa" w:w="1568"/>
+          </w:tcPr>
+          <w:p>
+            <w:r/>
+            <w:r>
+              <w:rPr>
+                <w:rFonts w:ascii="Calibri" w:hAnsi="Calibri"/>
+                <w:sz w:val="18"/>
+              </w:rPr>
+              <w:t>Leave &amp; Permissions</w:t>
+            </w:r>
+          </w:p>
+        </w:tc>
+        <w:tc>
+          <w:tcPr>
+            <w:tcW w:type="dxa" w:w="1568"/>
+          </w:tcPr>
+          <w:p>
+            <w:r/>
+            <w:r>
+              <w:rPr>
+                <w:rFonts w:ascii="Calibri" w:hAnsi="Calibri"/>
+                <w:sz w:val="18"/>
+              </w:rPr>
+              <w:t>Approval Workflow Issue</w:t>
+            </w:r>
+          </w:p>
+        </w:tc>
+        <w:tc>
+          <w:tcPr>
+            <w:tcW w:type="dxa" w:w="1568"/>
+          </w:tcPr>
+          <w:p>
+            <w:r/>
+            <w:r>
+              <w:rPr>
+                <w:rFonts w:ascii="Calibri" w:hAnsi="Calibri"/>
+                <w:sz w:val="18"/>
+              </w:rPr>
+              <w:t>RITM Resolution SLA(1 days)</w:t>
+            </w:r>
+          </w:p>
+        </w:tc>
+        <w:tc>
+          <w:tcPr>
+            <w:tcW w:type="dxa" w:w="1568"/>
+          </w:tcPr>
+          <w:p>
+            <w:r/>
+            <w:r>
+              <w:rPr>
+                <w:rFonts w:ascii="Calibri" w:hAnsi="Calibri"/>
                 <w:sz w:val="18"/>
               </w:rPr>
               <w:t>DGE HQ IT CDP OneHub Support</w:t>
@@ -7115,12 +7404,14 @@
       <w:tr>
         <w:tc>
           <w:tcPr>
-            <w:tcW w:type="dxa" w:w="1881"/>
-            <w:shd w:fill="E8F0FE" w:val="clear"/>
-          </w:tcPr>
-          <w:p>
-            <w:r>
-              <w:rPr>
+            <w:tcW w:type="dxa" w:w="1568"/>
+            <w:shd w:val="clear" w:color="auto" w:fill="D9E2F3"/>
+          </w:tcPr>
+          <w:p>
+            <w:r/>
+            <w:r>
+              <w:rPr>
+                <w:rFonts w:ascii="Calibri" w:hAnsi="Calibri"/>
                 <w:sz w:val="18"/>
               </w:rPr>
               <w:t>OneHub Service</w:t>
@@ -7129,12 +7420,30 @@
         </w:tc>
         <w:tc>
           <w:tcPr>
-            <w:tcW w:type="dxa" w:w="1881"/>
-            <w:shd w:fill="E8F0FE" w:val="clear"/>
-          </w:tcPr>
-          <w:p>
-            <w:r>
-              <w:rPr>
+            <w:tcW w:type="dxa" w:w="1568"/>
+            <w:shd w:val="clear" w:color="auto" w:fill="D9E2F3"/>
+          </w:tcPr>
+          <w:p>
+            <w:r/>
+            <w:r>
+              <w:rPr>
+                <w:rFonts w:ascii="Calibri" w:hAnsi="Calibri"/>
+                <w:sz w:val="18"/>
+              </w:rPr>
+              <w:t>OneHUB</w:t>
+            </w:r>
+          </w:p>
+        </w:tc>
+        <w:tc>
+          <w:tcPr>
+            <w:tcW w:type="dxa" w:w="1568"/>
+            <w:shd w:val="clear" w:color="auto" w:fill="D9E2F3"/>
+          </w:tcPr>
+          <w:p>
+            <w:r/>
+            <w:r>
+              <w:rPr>
+                <w:rFonts w:ascii="Calibri" w:hAnsi="Calibri"/>
                 <w:sz w:val="18"/>
               </w:rPr>
               <w:t>HR &amp; Employee Services</w:t>
@@ -7143,40 +7452,46 @@
         </w:tc>
         <w:tc>
           <w:tcPr>
-            <w:tcW w:type="dxa" w:w="1881"/>
-            <w:shd w:fill="E8F0FE" w:val="clear"/>
-          </w:tcPr>
-          <w:p>
-            <w:r>
-              <w:rPr>
-                <w:sz w:val="18"/>
-              </w:rPr>
-              <w:t>Employee Contract Issue</w:t>
-            </w:r>
-          </w:p>
-        </w:tc>
-        <w:tc>
-          <w:tcPr>
-            <w:tcW w:type="dxa" w:w="1881"/>
-            <w:shd w:fill="E8F0FE" w:val="clear"/>
-          </w:tcPr>
-          <w:p>
-            <w:r>
-              <w:rPr>
-                <w:sz w:val="18"/>
-              </w:rPr>
-              <w:t>2 days</w:t>
-            </w:r>
-          </w:p>
-        </w:tc>
-        <w:tc>
-          <w:tcPr>
-            <w:tcW w:type="dxa" w:w="1881"/>
-            <w:shd w:fill="E8F0FE" w:val="clear"/>
-          </w:tcPr>
-          <w:p>
-            <w:r>
-              <w:rPr>
+            <w:tcW w:type="dxa" w:w="1568"/>
+            <w:shd w:val="clear" w:color="auto" w:fill="D9E2F3"/>
+          </w:tcPr>
+          <w:p>
+            <w:r/>
+            <w:r>
+              <w:rPr>
+                <w:rFonts w:ascii="Calibri" w:hAnsi="Calibri"/>
+                <w:sz w:val="18"/>
+              </w:rPr>
+              <w:t>Salary / Employment Certificate</w:t>
+            </w:r>
+          </w:p>
+        </w:tc>
+        <w:tc>
+          <w:tcPr>
+            <w:tcW w:type="dxa" w:w="1568"/>
+            <w:shd w:val="clear" w:color="auto" w:fill="D9E2F3"/>
+          </w:tcPr>
+          <w:p>
+            <w:r/>
+            <w:r>
+              <w:rPr>
+                <w:rFonts w:ascii="Calibri" w:hAnsi="Calibri"/>
+                <w:sz w:val="18"/>
+              </w:rPr>
+              <w:t>RITM Resolution SLA(2 days)</w:t>
+            </w:r>
+          </w:p>
+        </w:tc>
+        <w:tc>
+          <w:tcPr>
+            <w:tcW w:type="dxa" w:w="1568"/>
+            <w:shd w:val="clear" w:color="auto" w:fill="D9E2F3"/>
+          </w:tcPr>
+          <w:p>
+            <w:r/>
+            <w:r>
+              <w:rPr>
+                <w:rFonts w:ascii="Calibri" w:hAnsi="Calibri"/>
                 <w:sz w:val="18"/>
               </w:rPr>
               <w:t>DGE HQ IT CDP OneHub Support</w:t>
@@ -7187,11 +7502,13 @@
       <w:tr>
         <w:tc>
           <w:tcPr>
-            <w:tcW w:type="dxa" w:w="1881"/>
-          </w:tcPr>
-          <w:p>
-            <w:r>
-              <w:rPr>
+            <w:tcW w:type="dxa" w:w="1568"/>
+          </w:tcPr>
+          <w:p>
+            <w:r/>
+            <w:r>
+              <w:rPr>
+                <w:rFonts w:ascii="Calibri" w:hAnsi="Calibri"/>
                 <w:sz w:val="18"/>
               </w:rPr>
               <w:t>OneHub Service</w:t>
@@ -7200,11 +7517,28 @@
         </w:tc>
         <w:tc>
           <w:tcPr>
-            <w:tcW w:type="dxa" w:w="1881"/>
-          </w:tcPr>
-          <w:p>
-            <w:r>
-              <w:rPr>
+            <w:tcW w:type="dxa" w:w="1568"/>
+          </w:tcPr>
+          <w:p>
+            <w:r/>
+            <w:r>
+              <w:rPr>
+                <w:rFonts w:ascii="Calibri" w:hAnsi="Calibri"/>
+                <w:sz w:val="18"/>
+              </w:rPr>
+              <w:t>OneHUB</w:t>
+            </w:r>
+          </w:p>
+        </w:tc>
+        <w:tc>
+          <w:tcPr>
+            <w:tcW w:type="dxa" w:w="1568"/>
+          </w:tcPr>
+          <w:p>
+            <w:r/>
+            <w:r>
+              <w:rPr>
+                <w:rFonts w:ascii="Calibri" w:hAnsi="Calibri"/>
                 <w:sz w:val="18"/>
               </w:rPr>
               <w:t>HR &amp; Employee Services</w:t>
@@ -7213,37 +7547,43 @@
         </w:tc>
         <w:tc>
           <w:tcPr>
-            <w:tcW w:type="dxa" w:w="1881"/>
-          </w:tcPr>
-          <w:p>
-            <w:r>
-              <w:rPr>
-                <w:sz w:val="18"/>
-              </w:rPr>
-              <w:t>Profile / Data Update</w:t>
-            </w:r>
-          </w:p>
-        </w:tc>
-        <w:tc>
-          <w:tcPr>
-            <w:tcW w:type="dxa" w:w="1881"/>
-          </w:tcPr>
-          <w:p>
-            <w:r>
-              <w:rPr>
-                <w:sz w:val="18"/>
-              </w:rPr>
-              <w:t>2 days</w:t>
-            </w:r>
-          </w:p>
-        </w:tc>
-        <w:tc>
-          <w:tcPr>
-            <w:tcW w:type="dxa" w:w="1881"/>
-          </w:tcPr>
-          <w:p>
-            <w:r>
-              <w:rPr>
+            <w:tcW w:type="dxa" w:w="1568"/>
+          </w:tcPr>
+          <w:p>
+            <w:r/>
+            <w:r>
+              <w:rPr>
+                <w:rFonts w:ascii="Calibri" w:hAnsi="Calibri"/>
+                <w:sz w:val="18"/>
+              </w:rPr>
+              <w:t>Employee Contract Issue</w:t>
+            </w:r>
+          </w:p>
+        </w:tc>
+        <w:tc>
+          <w:tcPr>
+            <w:tcW w:type="dxa" w:w="1568"/>
+          </w:tcPr>
+          <w:p>
+            <w:r/>
+            <w:r>
+              <w:rPr>
+                <w:rFonts w:ascii="Calibri" w:hAnsi="Calibri"/>
+                <w:sz w:val="18"/>
+              </w:rPr>
+              <w:t>RITM Resolution SLA(2 days)</w:t>
+            </w:r>
+          </w:p>
+        </w:tc>
+        <w:tc>
+          <w:tcPr>
+            <w:tcW w:type="dxa" w:w="1568"/>
+          </w:tcPr>
+          <w:p>
+            <w:r/>
+            <w:r>
+              <w:rPr>
+                <w:rFonts w:ascii="Calibri" w:hAnsi="Calibri"/>
                 <w:sz w:val="18"/>
               </w:rPr>
               <w:t>DGE HQ IT CDP OneHub Support</w:t>
@@ -7254,12 +7594,14 @@
       <w:tr>
         <w:tc>
           <w:tcPr>
-            <w:tcW w:type="dxa" w:w="1881"/>
-            <w:shd w:fill="E8F0FE" w:val="clear"/>
-          </w:tcPr>
-          <w:p>
-            <w:r>
-              <w:rPr>
+            <w:tcW w:type="dxa" w:w="1568"/>
+            <w:shd w:val="clear" w:color="auto" w:fill="D9E2F3"/>
+          </w:tcPr>
+          <w:p>
+            <w:r/>
+            <w:r>
+              <w:rPr>
+                <w:rFonts w:ascii="Calibri" w:hAnsi="Calibri"/>
                 <w:sz w:val="18"/>
               </w:rPr>
               <w:t>OneHub Service</w:t>
@@ -7268,12 +7610,30 @@
         </w:tc>
         <w:tc>
           <w:tcPr>
-            <w:tcW w:type="dxa" w:w="1881"/>
-            <w:shd w:fill="E8F0FE" w:val="clear"/>
-          </w:tcPr>
-          <w:p>
-            <w:r>
-              <w:rPr>
+            <w:tcW w:type="dxa" w:w="1568"/>
+            <w:shd w:val="clear" w:color="auto" w:fill="D9E2F3"/>
+          </w:tcPr>
+          <w:p>
+            <w:r/>
+            <w:r>
+              <w:rPr>
+                <w:rFonts w:ascii="Calibri" w:hAnsi="Calibri"/>
+                <w:sz w:val="18"/>
+              </w:rPr>
+              <w:t>OneHUB</w:t>
+            </w:r>
+          </w:p>
+        </w:tc>
+        <w:tc>
+          <w:tcPr>
+            <w:tcW w:type="dxa" w:w="1568"/>
+            <w:shd w:val="clear" w:color="auto" w:fill="D9E2F3"/>
+          </w:tcPr>
+          <w:p>
+            <w:r/>
+            <w:r>
+              <w:rPr>
+                <w:rFonts w:ascii="Calibri" w:hAnsi="Calibri"/>
                 <w:sz w:val="18"/>
               </w:rPr>
               <w:t>HR &amp; Employee Services</w:t>
@@ -7282,40 +7642,46 @@
         </w:tc>
         <w:tc>
           <w:tcPr>
-            <w:tcW w:type="dxa" w:w="1881"/>
-            <w:shd w:fill="E8F0FE" w:val="clear"/>
-          </w:tcPr>
-          <w:p>
-            <w:r>
-              <w:rPr>
-                <w:sz w:val="18"/>
-              </w:rPr>
-              <w:t>Performance / Evaluation</w:t>
-            </w:r>
-          </w:p>
-        </w:tc>
-        <w:tc>
-          <w:tcPr>
-            <w:tcW w:type="dxa" w:w="1881"/>
-            <w:shd w:fill="E8F0FE" w:val="clear"/>
-          </w:tcPr>
-          <w:p>
-            <w:r>
-              <w:rPr>
-                <w:sz w:val="18"/>
-              </w:rPr>
-              <w:t>2 days</w:t>
-            </w:r>
-          </w:p>
-        </w:tc>
-        <w:tc>
-          <w:tcPr>
-            <w:tcW w:type="dxa" w:w="1881"/>
-            <w:shd w:fill="E8F0FE" w:val="clear"/>
-          </w:tcPr>
-          <w:p>
-            <w:r>
-              <w:rPr>
+            <w:tcW w:type="dxa" w:w="1568"/>
+            <w:shd w:val="clear" w:color="auto" w:fill="D9E2F3"/>
+          </w:tcPr>
+          <w:p>
+            <w:r/>
+            <w:r>
+              <w:rPr>
+                <w:rFonts w:ascii="Calibri" w:hAnsi="Calibri"/>
+                <w:sz w:val="18"/>
+              </w:rPr>
+              <w:t>Profile / Personal Data Update</w:t>
+            </w:r>
+          </w:p>
+        </w:tc>
+        <w:tc>
+          <w:tcPr>
+            <w:tcW w:type="dxa" w:w="1568"/>
+            <w:shd w:val="clear" w:color="auto" w:fill="D9E2F3"/>
+          </w:tcPr>
+          <w:p>
+            <w:r/>
+            <w:r>
+              <w:rPr>
+                <w:rFonts w:ascii="Calibri" w:hAnsi="Calibri"/>
+                <w:sz w:val="18"/>
+              </w:rPr>
+              <w:t>RITM Resolution SLA(2 days)</w:t>
+            </w:r>
+          </w:p>
+        </w:tc>
+        <w:tc>
+          <w:tcPr>
+            <w:tcW w:type="dxa" w:w="1568"/>
+            <w:shd w:val="clear" w:color="auto" w:fill="D9E2F3"/>
+          </w:tcPr>
+          <w:p>
+            <w:r/>
+            <w:r>
+              <w:rPr>
+                <w:rFonts w:ascii="Calibri" w:hAnsi="Calibri"/>
                 <w:sz w:val="18"/>
               </w:rPr>
               <w:t>DGE HQ IT CDP OneHub Support</w:t>
@@ -7326,11 +7692,13 @@
       <w:tr>
         <w:tc>
           <w:tcPr>
-            <w:tcW w:type="dxa" w:w="1881"/>
-          </w:tcPr>
-          <w:p>
-            <w:r>
-              <w:rPr>
+            <w:tcW w:type="dxa" w:w="1568"/>
+          </w:tcPr>
+          <w:p>
+            <w:r/>
+            <w:r>
+              <w:rPr>
+                <w:rFonts w:ascii="Calibri" w:hAnsi="Calibri"/>
                 <w:sz w:val="18"/>
               </w:rPr>
               <w:t>OneHub Service</w:t>
@@ -7339,50 +7707,73 @@
         </w:tc>
         <w:tc>
           <w:tcPr>
-            <w:tcW w:type="dxa" w:w="1881"/>
-          </w:tcPr>
-          <w:p>
-            <w:r>
-              <w:rPr>
-                <w:sz w:val="18"/>
-              </w:rPr>
-              <w:t>Platform Configuration</w:t>
-            </w:r>
-          </w:p>
-        </w:tc>
-        <w:tc>
-          <w:tcPr>
-            <w:tcW w:type="dxa" w:w="1881"/>
-          </w:tcPr>
-          <w:p>
-            <w:r>
-              <w:rPr>
-                <w:sz w:val="18"/>
-              </w:rPr>
-              <w:t>Activate / Deactivate Featured App</w:t>
-            </w:r>
-          </w:p>
-        </w:tc>
-        <w:tc>
-          <w:tcPr>
-            <w:tcW w:type="dxa" w:w="1881"/>
-          </w:tcPr>
-          <w:p>
-            <w:r>
-              <w:rPr>
-                <w:sz w:val="18"/>
-              </w:rPr>
-              <w:t>2 days</w:t>
-            </w:r>
-          </w:p>
-        </w:tc>
-        <w:tc>
-          <w:tcPr>
-            <w:tcW w:type="dxa" w:w="1881"/>
-          </w:tcPr>
-          <w:p>
-            <w:r>
-              <w:rPr>
+            <w:tcW w:type="dxa" w:w="1568"/>
+          </w:tcPr>
+          <w:p>
+            <w:r/>
+            <w:r>
+              <w:rPr>
+                <w:rFonts w:ascii="Calibri" w:hAnsi="Calibri"/>
+                <w:sz w:val="18"/>
+              </w:rPr>
+              <w:t>OneHUB</w:t>
+            </w:r>
+          </w:p>
+        </w:tc>
+        <w:tc>
+          <w:tcPr>
+            <w:tcW w:type="dxa" w:w="1568"/>
+          </w:tcPr>
+          <w:p>
+            <w:r/>
+            <w:r>
+              <w:rPr>
+                <w:rFonts w:ascii="Calibri" w:hAnsi="Calibri"/>
+                <w:sz w:val="18"/>
+              </w:rPr>
+              <w:t>HR &amp; Employee Services</w:t>
+            </w:r>
+          </w:p>
+        </w:tc>
+        <w:tc>
+          <w:tcPr>
+            <w:tcW w:type="dxa" w:w="1568"/>
+          </w:tcPr>
+          <w:p>
+            <w:r/>
+            <w:r>
+              <w:rPr>
+                <w:rFonts w:ascii="Calibri" w:hAnsi="Calibri"/>
+                <w:sz w:val="18"/>
+              </w:rPr>
+              <w:t>Delegation of Responsibilities</w:t>
+            </w:r>
+          </w:p>
+        </w:tc>
+        <w:tc>
+          <w:tcPr>
+            <w:tcW w:type="dxa" w:w="1568"/>
+          </w:tcPr>
+          <w:p>
+            <w:r/>
+            <w:r>
+              <w:rPr>
+                <w:rFonts w:ascii="Calibri" w:hAnsi="Calibri"/>
+                <w:sz w:val="18"/>
+              </w:rPr>
+              <w:t>RITM Resolution SLA(2 days)</w:t>
+            </w:r>
+          </w:p>
+        </w:tc>
+        <w:tc>
+          <w:tcPr>
+            <w:tcW w:type="dxa" w:w="1568"/>
+          </w:tcPr>
+          <w:p>
+            <w:r/>
+            <w:r>
+              <w:rPr>
+                <w:rFonts w:ascii="Calibri" w:hAnsi="Calibri"/>
                 <w:sz w:val="18"/>
               </w:rPr>
               <w:t>DGE HQ IT CDP OneHub Support</w:t>
@@ -7393,12 +7784,14 @@
       <w:tr>
         <w:tc>
           <w:tcPr>
-            <w:tcW w:type="dxa" w:w="1881"/>
-            <w:shd w:fill="E8F0FE" w:val="clear"/>
-          </w:tcPr>
-          <w:p>
-            <w:r>
-              <w:rPr>
+            <w:tcW w:type="dxa" w:w="1568"/>
+            <w:shd w:val="clear" w:color="auto" w:fill="D9E2F3"/>
+          </w:tcPr>
+          <w:p>
+            <w:r/>
+            <w:r>
+              <w:rPr>
+                <w:rFonts w:ascii="Calibri" w:hAnsi="Calibri"/>
                 <w:sz w:val="18"/>
               </w:rPr>
               <w:t>OneHub Service</w:t>
@@ -7407,54 +7800,78 @@
         </w:tc>
         <w:tc>
           <w:tcPr>
-            <w:tcW w:type="dxa" w:w="1881"/>
-            <w:shd w:fill="E8F0FE" w:val="clear"/>
-          </w:tcPr>
-          <w:p>
-            <w:r>
-              <w:rPr>
-                <w:sz w:val="18"/>
-              </w:rPr>
-              <w:t>Platform Configuration</w:t>
-            </w:r>
-          </w:p>
-        </w:tc>
-        <w:tc>
-          <w:tcPr>
-            <w:tcW w:type="dxa" w:w="1881"/>
-            <w:shd w:fill="E8F0FE" w:val="clear"/>
-          </w:tcPr>
-          <w:p>
-            <w:r>
-              <w:rPr>
-                <w:sz w:val="18"/>
-              </w:rPr>
-              <w:t>Add New Featured Application</w:t>
-            </w:r>
-          </w:p>
-        </w:tc>
-        <w:tc>
-          <w:tcPr>
-            <w:tcW w:type="dxa" w:w="1881"/>
-            <w:shd w:fill="E8F0FE" w:val="clear"/>
-          </w:tcPr>
-          <w:p>
-            <w:r>
-              <w:rPr>
-                <w:sz w:val="18"/>
-              </w:rPr>
-              <w:t>4 days</w:t>
-            </w:r>
-          </w:p>
-        </w:tc>
-        <w:tc>
-          <w:tcPr>
-            <w:tcW w:type="dxa" w:w="1881"/>
-            <w:shd w:fill="E8F0FE" w:val="clear"/>
-          </w:tcPr>
-          <w:p>
-            <w:r>
-              <w:rPr>
+            <w:tcW w:type="dxa" w:w="1568"/>
+            <w:shd w:val="clear" w:color="auto" w:fill="D9E2F3"/>
+          </w:tcPr>
+          <w:p>
+            <w:r/>
+            <w:r>
+              <w:rPr>
+                <w:rFonts w:ascii="Calibri" w:hAnsi="Calibri"/>
+                <w:sz w:val="18"/>
+              </w:rPr>
+              <w:t>OneHUB</w:t>
+            </w:r>
+          </w:p>
+        </w:tc>
+        <w:tc>
+          <w:tcPr>
+            <w:tcW w:type="dxa" w:w="1568"/>
+            <w:shd w:val="clear" w:color="auto" w:fill="D9E2F3"/>
+          </w:tcPr>
+          <w:p>
+            <w:r/>
+            <w:r>
+              <w:rPr>
+                <w:rFonts w:ascii="Calibri" w:hAnsi="Calibri"/>
+                <w:sz w:val="18"/>
+              </w:rPr>
+              <w:t>HR &amp; Employee Services</w:t>
+            </w:r>
+          </w:p>
+        </w:tc>
+        <w:tc>
+          <w:tcPr>
+            <w:tcW w:type="dxa" w:w="1568"/>
+            <w:shd w:val="clear" w:color="auto" w:fill="D9E2F3"/>
+          </w:tcPr>
+          <w:p>
+            <w:r/>
+            <w:r>
+              <w:rPr>
+                <w:rFonts w:ascii="Calibri" w:hAnsi="Calibri"/>
+                <w:sz w:val="18"/>
+              </w:rPr>
+              <w:t>Pay Slip Issue</w:t>
+            </w:r>
+          </w:p>
+        </w:tc>
+        <w:tc>
+          <w:tcPr>
+            <w:tcW w:type="dxa" w:w="1568"/>
+            <w:shd w:val="clear" w:color="auto" w:fill="D9E2F3"/>
+          </w:tcPr>
+          <w:p>
+            <w:r/>
+            <w:r>
+              <w:rPr>
+                <w:rFonts w:ascii="Calibri" w:hAnsi="Calibri"/>
+                <w:sz w:val="18"/>
+              </w:rPr>
+              <w:t>RITM Resolution SLA(2 days)</w:t>
+            </w:r>
+          </w:p>
+        </w:tc>
+        <w:tc>
+          <w:tcPr>
+            <w:tcW w:type="dxa" w:w="1568"/>
+            <w:shd w:val="clear" w:color="auto" w:fill="D9E2F3"/>
+          </w:tcPr>
+          <w:p>
+            <w:r/>
+            <w:r>
+              <w:rPr>
+                <w:rFonts w:ascii="Calibri" w:hAnsi="Calibri"/>
                 <w:sz w:val="18"/>
               </w:rPr>
               <w:t>DGE HQ IT CDP OneHub Support</w:t>
@@ -7465,11 +7882,13 @@
       <w:tr>
         <w:tc>
           <w:tcPr>
-            <w:tcW w:type="dxa" w:w="1881"/>
-          </w:tcPr>
-          <w:p>
-            <w:r>
-              <w:rPr>
+            <w:tcW w:type="dxa" w:w="1568"/>
+          </w:tcPr>
+          <w:p>
+            <w:r/>
+            <w:r>
+              <w:rPr>
+                <w:rFonts w:ascii="Calibri" w:hAnsi="Calibri"/>
                 <w:sz w:val="18"/>
               </w:rPr>
               <w:t>OneHub Service</w:t>
@@ -7478,50 +7897,73 @@
         </w:tc>
         <w:tc>
           <w:tcPr>
-            <w:tcW w:type="dxa" w:w="1881"/>
-          </w:tcPr>
-          <w:p>
-            <w:r>
-              <w:rPr>
-                <w:sz w:val="18"/>
-              </w:rPr>
-              <w:t>Platform Configuration</w:t>
-            </w:r>
-          </w:p>
-        </w:tc>
-        <w:tc>
-          <w:tcPr>
-            <w:tcW w:type="dxa" w:w="1881"/>
-          </w:tcPr>
-          <w:p>
-            <w:r>
-              <w:rPr>
-                <w:sz w:val="18"/>
-              </w:rPr>
-              <w:t>Hide / Unhide Org Chart</w:t>
-            </w:r>
-          </w:p>
-        </w:tc>
-        <w:tc>
-          <w:tcPr>
-            <w:tcW w:type="dxa" w:w="1881"/>
-          </w:tcPr>
-          <w:p>
-            <w:r>
-              <w:rPr>
-                <w:sz w:val="18"/>
-              </w:rPr>
-              <w:t>1 day</w:t>
-            </w:r>
-          </w:p>
-        </w:tc>
-        <w:tc>
-          <w:tcPr>
-            <w:tcW w:type="dxa" w:w="1881"/>
-          </w:tcPr>
-          <w:p>
-            <w:r>
-              <w:rPr>
+            <w:tcW w:type="dxa" w:w="1568"/>
+          </w:tcPr>
+          <w:p>
+            <w:r/>
+            <w:r>
+              <w:rPr>
+                <w:rFonts w:ascii="Calibri" w:hAnsi="Calibri"/>
+                <w:sz w:val="18"/>
+              </w:rPr>
+              <w:t>OneHUB</w:t>
+            </w:r>
+          </w:p>
+        </w:tc>
+        <w:tc>
+          <w:tcPr>
+            <w:tcW w:type="dxa" w:w="1568"/>
+          </w:tcPr>
+          <w:p>
+            <w:r/>
+            <w:r>
+              <w:rPr>
+                <w:rFonts w:ascii="Calibri" w:hAnsi="Calibri"/>
+                <w:sz w:val="18"/>
+              </w:rPr>
+              <w:t>HR &amp; Employee Services</w:t>
+            </w:r>
+          </w:p>
+        </w:tc>
+        <w:tc>
+          <w:tcPr>
+            <w:tcW w:type="dxa" w:w="1568"/>
+          </w:tcPr>
+          <w:p>
+            <w:r/>
+            <w:r>
+              <w:rPr>
+                <w:rFonts w:ascii="Calibri" w:hAnsi="Calibri"/>
+                <w:sz w:val="18"/>
+              </w:rPr>
+              <w:t>Performance / Evaluation Issue</w:t>
+            </w:r>
+          </w:p>
+        </w:tc>
+        <w:tc>
+          <w:tcPr>
+            <w:tcW w:type="dxa" w:w="1568"/>
+          </w:tcPr>
+          <w:p>
+            <w:r/>
+            <w:r>
+              <w:rPr>
+                <w:rFonts w:ascii="Calibri" w:hAnsi="Calibri"/>
+                <w:sz w:val="18"/>
+              </w:rPr>
+              <w:t>RITM Resolution SLA(2 days)</w:t>
+            </w:r>
+          </w:p>
+        </w:tc>
+        <w:tc>
+          <w:tcPr>
+            <w:tcW w:type="dxa" w:w="1568"/>
+          </w:tcPr>
+          <w:p>
+            <w:r/>
+            <w:r>
+              <w:rPr>
+                <w:rFonts w:ascii="Calibri" w:hAnsi="Calibri"/>
                 <w:sz w:val="18"/>
               </w:rPr>
               <w:t>DGE HQ IT CDP OneHub Support</w:t>
@@ -7532,12 +7974,14 @@
       <w:tr>
         <w:tc>
           <w:tcPr>
-            <w:tcW w:type="dxa" w:w="1881"/>
-            <w:shd w:fill="E8F0FE" w:val="clear"/>
-          </w:tcPr>
-          <w:p>
-            <w:r>
-              <w:rPr>
+            <w:tcW w:type="dxa" w:w="1568"/>
+            <w:shd w:val="clear" w:color="auto" w:fill="D9E2F3"/>
+          </w:tcPr>
+          <w:p>
+            <w:r/>
+            <w:r>
+              <w:rPr>
+                <w:rFonts w:ascii="Calibri" w:hAnsi="Calibri"/>
                 <w:sz w:val="18"/>
               </w:rPr>
               <w:t>OneHub Service</w:t>
@@ -7546,12 +7990,30 @@
         </w:tc>
         <w:tc>
           <w:tcPr>
-            <w:tcW w:type="dxa" w:w="1881"/>
-            <w:shd w:fill="E8F0FE" w:val="clear"/>
-          </w:tcPr>
-          <w:p>
-            <w:r>
-              <w:rPr>
+            <w:tcW w:type="dxa" w:w="1568"/>
+            <w:shd w:val="clear" w:color="auto" w:fill="D9E2F3"/>
+          </w:tcPr>
+          <w:p>
+            <w:r/>
+            <w:r>
+              <w:rPr>
+                <w:rFonts w:ascii="Calibri" w:hAnsi="Calibri"/>
+                <w:sz w:val="18"/>
+              </w:rPr>
+              <w:t>OneHUB</w:t>
+            </w:r>
+          </w:p>
+        </w:tc>
+        <w:tc>
+          <w:tcPr>
+            <w:tcW w:type="dxa" w:w="1568"/>
+            <w:shd w:val="clear" w:color="auto" w:fill="D9E2F3"/>
+          </w:tcPr>
+          <w:p>
+            <w:r/>
+            <w:r>
+              <w:rPr>
+                <w:rFonts w:ascii="Calibri" w:hAnsi="Calibri"/>
                 <w:sz w:val="18"/>
               </w:rPr>
               <w:t>Platform Configuration</w:t>
@@ -7560,40 +8022,45 @@
         </w:tc>
         <w:tc>
           <w:tcPr>
-            <w:tcW w:type="dxa" w:w="1881"/>
-            <w:shd w:fill="E8F0FE" w:val="clear"/>
-          </w:tcPr>
-          <w:p>
-            <w:r>
-              <w:rPr>
-                <w:sz w:val="18"/>
-              </w:rPr>
-              <w:t>App Registration / Config Change</w:t>
-            </w:r>
-          </w:p>
-        </w:tc>
-        <w:tc>
-          <w:tcPr>
-            <w:tcW w:type="dxa" w:w="1881"/>
-            <w:shd w:fill="E8F0FE" w:val="clear"/>
-          </w:tcPr>
-          <w:p>
-            <w:r>
-              <w:rPr>
-                <w:sz w:val="18"/>
-              </w:rPr>
-              <w:t>2 days</w:t>
-            </w:r>
-          </w:p>
-        </w:tc>
-        <w:tc>
-          <w:tcPr>
-            <w:tcW w:type="dxa" w:w="1881"/>
-            <w:shd w:fill="E8F0FE" w:val="clear"/>
-          </w:tcPr>
-          <w:p>
-            <w:r>
-              <w:rPr>
+            <w:tcW w:type="dxa" w:w="1568"/>
+            <w:shd w:val="clear" w:color="auto" w:fill="D9E2F3"/>
+          </w:tcPr>
+          <w:p>
+            <w:r/>
+            <w:r>
+              <w:rPr>
+                <w:rFonts w:ascii="Calibri" w:hAnsi="Calibri"/>
+                <w:sz w:val="18"/>
+              </w:rPr>
+              <w:t>Activate New Service</w:t>
+            </w:r>
+          </w:p>
+        </w:tc>
+        <w:tc>
+          <w:tcPr>
+            <w:tcW w:type="dxa" w:w="1568"/>
+            <w:shd w:val="clear" w:color="auto" w:fill="D9E2F3"/>
+          </w:tcPr>
+          <w:p>
+            <w:r/>
+            <w:r>
+              <w:rPr>
+                <w:rFonts w:ascii="Calibri" w:hAnsi="Calibri"/>
+                <w:sz w:val="18"/>
+              </w:rPr>
+            </w:r>
+          </w:p>
+        </w:tc>
+        <w:tc>
+          <w:tcPr>
+            <w:tcW w:type="dxa" w:w="1568"/>
+            <w:shd w:val="clear" w:color="auto" w:fill="D9E2F3"/>
+          </w:tcPr>
+          <w:p>
+            <w:r/>
+            <w:r>
+              <w:rPr>
+                <w:rFonts w:ascii="Calibri" w:hAnsi="Calibri"/>
                 <w:sz w:val="18"/>
               </w:rPr>
               <w:t>DGE HQ IT CDP OneHub Support</w:t>
@@ -7604,11 +8071,13 @@
       <w:tr>
         <w:tc>
           <w:tcPr>
-            <w:tcW w:type="dxa" w:w="1881"/>
-          </w:tcPr>
-          <w:p>
-            <w:r>
-              <w:rPr>
+            <w:tcW w:type="dxa" w:w="1568"/>
+          </w:tcPr>
+          <w:p>
+            <w:r/>
+            <w:r>
+              <w:rPr>
+                <w:rFonts w:ascii="Calibri" w:hAnsi="Calibri"/>
                 <w:sz w:val="18"/>
               </w:rPr>
               <w:t>OneHub Service</w:t>
@@ -7617,50 +8086,73 @@
         </w:tc>
         <w:tc>
           <w:tcPr>
-            <w:tcW w:type="dxa" w:w="1881"/>
-          </w:tcPr>
-          <w:p>
-            <w:r>
-              <w:rPr>
-                <w:sz w:val="18"/>
-              </w:rPr>
-              <w:t>Integration &amp; Systems</w:t>
-            </w:r>
-          </w:p>
-        </w:tc>
-        <w:tc>
-          <w:tcPr>
-            <w:tcW w:type="dxa" w:w="1881"/>
-          </w:tcPr>
-          <w:p>
-            <w:r>
-              <w:rPr>
-                <w:sz w:val="18"/>
-              </w:rPr>
-              <w:t>ADERP / ERP Integration Issue</w:t>
-            </w:r>
-          </w:p>
-        </w:tc>
-        <w:tc>
-          <w:tcPr>
-            <w:tcW w:type="dxa" w:w="1881"/>
-          </w:tcPr>
-          <w:p>
-            <w:r>
-              <w:rPr>
-                <w:sz w:val="18"/>
-              </w:rPr>
-              <w:t>2 days</w:t>
-            </w:r>
-          </w:p>
-        </w:tc>
-        <w:tc>
-          <w:tcPr>
-            <w:tcW w:type="dxa" w:w="1881"/>
-          </w:tcPr>
-          <w:p>
-            <w:r>
-              <w:rPr>
+            <w:tcW w:type="dxa" w:w="1568"/>
+          </w:tcPr>
+          <w:p>
+            <w:r/>
+            <w:r>
+              <w:rPr>
+                <w:rFonts w:ascii="Calibri" w:hAnsi="Calibri"/>
+                <w:sz w:val="18"/>
+              </w:rPr>
+              <w:t>OneHUB</w:t>
+            </w:r>
+          </w:p>
+        </w:tc>
+        <w:tc>
+          <w:tcPr>
+            <w:tcW w:type="dxa" w:w="1568"/>
+          </w:tcPr>
+          <w:p>
+            <w:r/>
+            <w:r>
+              <w:rPr>
+                <w:rFonts w:ascii="Calibri" w:hAnsi="Calibri"/>
+                <w:sz w:val="18"/>
+              </w:rPr>
+              <w:t>Platform Configuration</w:t>
+            </w:r>
+          </w:p>
+        </w:tc>
+        <w:tc>
+          <w:tcPr>
+            <w:tcW w:type="dxa" w:w="1568"/>
+          </w:tcPr>
+          <w:p>
+            <w:r/>
+            <w:r>
+              <w:rPr>
+                <w:rFonts w:ascii="Calibri" w:hAnsi="Calibri"/>
+                <w:sz w:val="18"/>
+              </w:rPr>
+              <w:t>Activate Existing Featured Application</w:t>
+            </w:r>
+          </w:p>
+        </w:tc>
+        <w:tc>
+          <w:tcPr>
+            <w:tcW w:type="dxa" w:w="1568"/>
+          </w:tcPr>
+          <w:p>
+            <w:r/>
+            <w:r>
+              <w:rPr>
+                <w:rFonts w:ascii="Calibri" w:hAnsi="Calibri"/>
+                <w:sz w:val="18"/>
+              </w:rPr>
+              <w:t>RITM Resolution SLA(2 days)</w:t>
+            </w:r>
+          </w:p>
+        </w:tc>
+        <w:tc>
+          <w:tcPr>
+            <w:tcW w:type="dxa" w:w="1568"/>
+          </w:tcPr>
+          <w:p>
+            <w:r/>
+            <w:r>
+              <w:rPr>
+                <w:rFonts w:ascii="Calibri" w:hAnsi="Calibri"/>
                 <w:sz w:val="18"/>
               </w:rPr>
               <w:t>DGE HQ IT CDP OneHub Support</w:t>
@@ -7671,12 +8163,14 @@
       <w:tr>
         <w:tc>
           <w:tcPr>
-            <w:tcW w:type="dxa" w:w="1881"/>
-            <w:shd w:fill="E8F0FE" w:val="clear"/>
-          </w:tcPr>
-          <w:p>
-            <w:r>
-              <w:rPr>
+            <w:tcW w:type="dxa" w:w="1568"/>
+            <w:shd w:val="clear" w:color="auto" w:fill="D9E2F3"/>
+          </w:tcPr>
+          <w:p>
+            <w:r/>
+            <w:r>
+              <w:rPr>
+                <w:rFonts w:ascii="Calibri" w:hAnsi="Calibri"/>
                 <w:sz w:val="18"/>
               </w:rPr>
               <w:t>OneHub Service</w:t>
@@ -7685,54 +8179,78 @@
         </w:tc>
         <w:tc>
           <w:tcPr>
-            <w:tcW w:type="dxa" w:w="1881"/>
-            <w:shd w:fill="E8F0FE" w:val="clear"/>
-          </w:tcPr>
-          <w:p>
-            <w:r>
-              <w:rPr>
-                <w:sz w:val="18"/>
-              </w:rPr>
-              <w:t>Integration &amp; Systems</w:t>
-            </w:r>
-          </w:p>
-        </w:tc>
-        <w:tc>
-          <w:tcPr>
-            <w:tcW w:type="dxa" w:w="1881"/>
-            <w:shd w:fill="E8F0FE" w:val="clear"/>
-          </w:tcPr>
-          <w:p>
-            <w:r>
-              <w:rPr>
-                <w:sz w:val="18"/>
-              </w:rPr>
-              <w:t>Notification / Approval Sync</w:t>
-            </w:r>
-          </w:p>
-        </w:tc>
-        <w:tc>
-          <w:tcPr>
-            <w:tcW w:type="dxa" w:w="1881"/>
-            <w:shd w:fill="E8F0FE" w:val="clear"/>
-          </w:tcPr>
-          <w:p>
-            <w:r>
-              <w:rPr>
-                <w:sz w:val="18"/>
-              </w:rPr>
-              <w:t>1 day</w:t>
-            </w:r>
-          </w:p>
-        </w:tc>
-        <w:tc>
-          <w:tcPr>
-            <w:tcW w:type="dxa" w:w="1881"/>
-            <w:shd w:fill="E8F0FE" w:val="clear"/>
-          </w:tcPr>
-          <w:p>
-            <w:r>
-              <w:rPr>
+            <w:tcW w:type="dxa" w:w="1568"/>
+            <w:shd w:val="clear" w:color="auto" w:fill="D9E2F3"/>
+          </w:tcPr>
+          <w:p>
+            <w:r/>
+            <w:r>
+              <w:rPr>
+                <w:rFonts w:ascii="Calibri" w:hAnsi="Calibri"/>
+                <w:sz w:val="18"/>
+              </w:rPr>
+              <w:t>OneHUB</w:t>
+            </w:r>
+          </w:p>
+        </w:tc>
+        <w:tc>
+          <w:tcPr>
+            <w:tcW w:type="dxa" w:w="1568"/>
+            <w:shd w:val="clear" w:color="auto" w:fill="D9E2F3"/>
+          </w:tcPr>
+          <w:p>
+            <w:r/>
+            <w:r>
+              <w:rPr>
+                <w:rFonts w:ascii="Calibri" w:hAnsi="Calibri"/>
+                <w:sz w:val="18"/>
+              </w:rPr>
+              <w:t>Platform Configuration</w:t>
+            </w:r>
+          </w:p>
+        </w:tc>
+        <w:tc>
+          <w:tcPr>
+            <w:tcW w:type="dxa" w:w="1568"/>
+            <w:shd w:val="clear" w:color="auto" w:fill="D9E2F3"/>
+          </w:tcPr>
+          <w:p>
+            <w:r/>
+            <w:r>
+              <w:rPr>
+                <w:rFonts w:ascii="Calibri" w:hAnsi="Calibri"/>
+                <w:sz w:val="18"/>
+              </w:rPr>
+              <w:t>Deactivate Existing Featured Application</w:t>
+            </w:r>
+          </w:p>
+        </w:tc>
+        <w:tc>
+          <w:tcPr>
+            <w:tcW w:type="dxa" w:w="1568"/>
+            <w:shd w:val="clear" w:color="auto" w:fill="D9E2F3"/>
+          </w:tcPr>
+          <w:p>
+            <w:r/>
+            <w:r>
+              <w:rPr>
+                <w:rFonts w:ascii="Calibri" w:hAnsi="Calibri"/>
+                <w:sz w:val="18"/>
+              </w:rPr>
+              <w:t>RITM Resolution SLA(2 days)</w:t>
+            </w:r>
+          </w:p>
+        </w:tc>
+        <w:tc>
+          <w:tcPr>
+            <w:tcW w:type="dxa" w:w="1568"/>
+            <w:shd w:val="clear" w:color="auto" w:fill="D9E2F3"/>
+          </w:tcPr>
+          <w:p>
+            <w:r/>
+            <w:r>
+              <w:rPr>
+                <w:rFonts w:ascii="Calibri" w:hAnsi="Calibri"/>
                 <w:sz w:val="18"/>
               </w:rPr>
               <w:t>DGE HQ IT CDP OneHub Support</w:t>
@@ -7743,11 +8261,13 @@
       <w:tr>
         <w:tc>
           <w:tcPr>
-            <w:tcW w:type="dxa" w:w="1881"/>
-          </w:tcPr>
-          <w:p>
-            <w:r>
-              <w:rPr>
+            <w:tcW w:type="dxa" w:w="1568"/>
+          </w:tcPr>
+          <w:p>
+            <w:r/>
+            <w:r>
+              <w:rPr>
+                <w:rFonts w:ascii="Calibri" w:hAnsi="Calibri"/>
                 <w:sz w:val="18"/>
               </w:rPr>
               <w:t>OneHub Service</w:t>
@@ -7756,50 +8276,73 @@
         </w:tc>
         <w:tc>
           <w:tcPr>
-            <w:tcW w:type="dxa" w:w="1881"/>
-          </w:tcPr>
-          <w:p>
-            <w:r>
-              <w:rPr>
-                <w:sz w:val="18"/>
-              </w:rPr>
-              <w:t>Integration &amp; Systems</w:t>
-            </w:r>
-          </w:p>
-        </w:tc>
-        <w:tc>
-          <w:tcPr>
-            <w:tcW w:type="dxa" w:w="1881"/>
-          </w:tcPr>
-          <w:p>
-            <w:r>
-              <w:rPr>
-                <w:sz w:val="18"/>
-              </w:rPr>
-              <w:t>API / Configuration Change</w:t>
-            </w:r>
-          </w:p>
-        </w:tc>
-        <w:tc>
-          <w:tcPr>
-            <w:tcW w:type="dxa" w:w="1881"/>
-          </w:tcPr>
-          <w:p>
-            <w:r>
-              <w:rPr>
-                <w:sz w:val="18"/>
-              </w:rPr>
-              <w:t>4 days</w:t>
-            </w:r>
-          </w:p>
-        </w:tc>
-        <w:tc>
-          <w:tcPr>
-            <w:tcW w:type="dxa" w:w="1881"/>
-          </w:tcPr>
-          <w:p>
-            <w:r>
-              <w:rPr>
+            <w:tcW w:type="dxa" w:w="1568"/>
+          </w:tcPr>
+          <w:p>
+            <w:r/>
+            <w:r>
+              <w:rPr>
+                <w:rFonts w:ascii="Calibri" w:hAnsi="Calibri"/>
+                <w:sz w:val="18"/>
+              </w:rPr>
+              <w:t>OneHUB</w:t>
+            </w:r>
+          </w:p>
+        </w:tc>
+        <w:tc>
+          <w:tcPr>
+            <w:tcW w:type="dxa" w:w="1568"/>
+          </w:tcPr>
+          <w:p>
+            <w:r/>
+            <w:r>
+              <w:rPr>
+                <w:rFonts w:ascii="Calibri" w:hAnsi="Calibri"/>
+                <w:sz w:val="18"/>
+              </w:rPr>
+              <w:t>Platform Configuration</w:t>
+            </w:r>
+          </w:p>
+        </w:tc>
+        <w:tc>
+          <w:tcPr>
+            <w:tcW w:type="dxa" w:w="1568"/>
+          </w:tcPr>
+          <w:p>
+            <w:r/>
+            <w:r>
+              <w:rPr>
+                <w:rFonts w:ascii="Calibri" w:hAnsi="Calibri"/>
+                <w:sz w:val="18"/>
+              </w:rPr>
+              <w:t>Add New Featured Application</w:t>
+            </w:r>
+          </w:p>
+        </w:tc>
+        <w:tc>
+          <w:tcPr>
+            <w:tcW w:type="dxa" w:w="1568"/>
+          </w:tcPr>
+          <w:p>
+            <w:r/>
+            <w:r>
+              <w:rPr>
+                <w:rFonts w:ascii="Calibri" w:hAnsi="Calibri"/>
+                <w:sz w:val="18"/>
+              </w:rPr>
+              <w:t>RITM Resolution SLA(4 days)</w:t>
+            </w:r>
+          </w:p>
+        </w:tc>
+        <w:tc>
+          <w:tcPr>
+            <w:tcW w:type="dxa" w:w="1568"/>
+          </w:tcPr>
+          <w:p>
+            <w:r/>
+            <w:r>
+              <w:rPr>
+                <w:rFonts w:ascii="Calibri" w:hAnsi="Calibri"/>
                 <w:sz w:val="18"/>
               </w:rPr>
               <w:t>DGE HQ IT CDP OneHub Support</w:t>
@@ -7810,12 +8353,14 @@
       <w:tr>
         <w:tc>
           <w:tcPr>
-            <w:tcW w:type="dxa" w:w="1881"/>
-            <w:shd w:fill="E8F0FE" w:val="clear"/>
-          </w:tcPr>
-          <w:p>
-            <w:r>
-              <w:rPr>
+            <w:tcW w:type="dxa" w:w="1568"/>
+            <w:shd w:val="clear" w:color="auto" w:fill="D9E2F3"/>
+          </w:tcPr>
+          <w:p>
+            <w:r/>
+            <w:r>
+              <w:rPr>
+                <w:rFonts w:ascii="Calibri" w:hAnsi="Calibri"/>
                 <w:sz w:val="18"/>
               </w:rPr>
               <w:t>OneHub Service</w:t>
@@ -7824,54 +8369,78 @@
         </w:tc>
         <w:tc>
           <w:tcPr>
-            <w:tcW w:type="dxa" w:w="1881"/>
-            <w:shd w:fill="E8F0FE" w:val="clear"/>
-          </w:tcPr>
-          <w:p>
-            <w:r>
-              <w:rPr>
-                <w:sz w:val="18"/>
-              </w:rPr>
-              <w:t>Mobile Application</w:t>
-            </w:r>
-          </w:p>
-        </w:tc>
-        <w:tc>
-          <w:tcPr>
-            <w:tcW w:type="dxa" w:w="1881"/>
-            <w:shd w:fill="E8F0FE" w:val="clear"/>
-          </w:tcPr>
-          <w:p>
-            <w:r>
-              <w:rPr>
-                <w:sz w:val="18"/>
-              </w:rPr>
-              <w:t>Mobile App Issue</w:t>
-            </w:r>
-          </w:p>
-        </w:tc>
-        <w:tc>
-          <w:tcPr>
-            <w:tcW w:type="dxa" w:w="1881"/>
-            <w:shd w:fill="E8F0FE" w:val="clear"/>
-          </w:tcPr>
-          <w:p>
-            <w:r>
-              <w:rPr>
-                <w:sz w:val="18"/>
-              </w:rPr>
-              <w:t>1 day</w:t>
-            </w:r>
-          </w:p>
-        </w:tc>
-        <w:tc>
-          <w:tcPr>
-            <w:tcW w:type="dxa" w:w="1881"/>
-            <w:shd w:fill="E8F0FE" w:val="clear"/>
-          </w:tcPr>
-          <w:p>
-            <w:r>
-              <w:rPr>
+            <w:tcW w:type="dxa" w:w="1568"/>
+            <w:shd w:val="clear" w:color="auto" w:fill="D9E2F3"/>
+          </w:tcPr>
+          <w:p>
+            <w:r/>
+            <w:r>
+              <w:rPr>
+                <w:rFonts w:ascii="Calibri" w:hAnsi="Calibri"/>
+                <w:sz w:val="18"/>
+              </w:rPr>
+              <w:t>OneHUB</w:t>
+            </w:r>
+          </w:p>
+        </w:tc>
+        <w:tc>
+          <w:tcPr>
+            <w:tcW w:type="dxa" w:w="1568"/>
+            <w:shd w:val="clear" w:color="auto" w:fill="D9E2F3"/>
+          </w:tcPr>
+          <w:p>
+            <w:r/>
+            <w:r>
+              <w:rPr>
+                <w:rFonts w:ascii="Calibri" w:hAnsi="Calibri"/>
+                <w:sz w:val="18"/>
+              </w:rPr>
+              <w:t>Platform Configuration</w:t>
+            </w:r>
+          </w:p>
+        </w:tc>
+        <w:tc>
+          <w:tcPr>
+            <w:tcW w:type="dxa" w:w="1568"/>
+            <w:shd w:val="clear" w:color="auto" w:fill="D9E2F3"/>
+          </w:tcPr>
+          <w:p>
+            <w:r/>
+            <w:r>
+              <w:rPr>
+                <w:rFonts w:ascii="Calibri" w:hAnsi="Calibri"/>
+                <w:sz w:val="18"/>
+              </w:rPr>
+              <w:t>Hide Org Chart</w:t>
+            </w:r>
+          </w:p>
+        </w:tc>
+        <w:tc>
+          <w:tcPr>
+            <w:tcW w:type="dxa" w:w="1568"/>
+            <w:shd w:val="clear" w:color="auto" w:fill="D9E2F3"/>
+          </w:tcPr>
+          <w:p>
+            <w:r/>
+            <w:r>
+              <w:rPr>
+                <w:rFonts w:ascii="Calibri" w:hAnsi="Calibri"/>
+                <w:sz w:val="18"/>
+              </w:rPr>
+              <w:t>RITM Resolution SLA(1 days)</w:t>
+            </w:r>
+          </w:p>
+        </w:tc>
+        <w:tc>
+          <w:tcPr>
+            <w:tcW w:type="dxa" w:w="1568"/>
+            <w:shd w:val="clear" w:color="auto" w:fill="D9E2F3"/>
+          </w:tcPr>
+          <w:p>
+            <w:r/>
+            <w:r>
+              <w:rPr>
+                <w:rFonts w:ascii="Calibri" w:hAnsi="Calibri"/>
                 <w:sz w:val="18"/>
               </w:rPr>
               <w:t>DGE HQ IT CDP OneHub Support</w:t>
@@ -7882,11 +8451,13 @@
       <w:tr>
         <w:tc>
           <w:tcPr>
-            <w:tcW w:type="dxa" w:w="1881"/>
-          </w:tcPr>
-          <w:p>
-            <w:r>
-              <w:rPr>
+            <w:tcW w:type="dxa" w:w="1568"/>
+          </w:tcPr>
+          <w:p>
+            <w:r/>
+            <w:r>
+              <w:rPr>
+                <w:rFonts w:ascii="Calibri" w:hAnsi="Calibri"/>
                 <w:sz w:val="18"/>
               </w:rPr>
               <w:t>OneHub Service</w:t>
@@ -7895,50 +8466,73 @@
         </w:tc>
         <w:tc>
           <w:tcPr>
-            <w:tcW w:type="dxa" w:w="1881"/>
-          </w:tcPr>
-          <w:p>
-            <w:r>
-              <w:rPr>
-                <w:sz w:val="18"/>
-              </w:rPr>
-              <w:t>Mobile Application</w:t>
-            </w:r>
-          </w:p>
-        </w:tc>
-        <w:tc>
-          <w:tcPr>
-            <w:tcW w:type="dxa" w:w="1881"/>
-          </w:tcPr>
-          <w:p>
-            <w:r>
-              <w:rPr>
-                <w:sz w:val="18"/>
-              </w:rPr>
-              <w:t>Mobile Login Issue</w:t>
-            </w:r>
-          </w:p>
-        </w:tc>
-        <w:tc>
-          <w:tcPr>
-            <w:tcW w:type="dxa" w:w="1881"/>
-          </w:tcPr>
-          <w:p>
-            <w:r>
-              <w:rPr>
-                <w:sz w:val="18"/>
-              </w:rPr>
-              <w:t>1 day</w:t>
-            </w:r>
-          </w:p>
-        </w:tc>
-        <w:tc>
-          <w:tcPr>
-            <w:tcW w:type="dxa" w:w="1881"/>
-          </w:tcPr>
-          <w:p>
-            <w:r>
-              <w:rPr>
+            <w:tcW w:type="dxa" w:w="1568"/>
+          </w:tcPr>
+          <w:p>
+            <w:r/>
+            <w:r>
+              <w:rPr>
+                <w:rFonts w:ascii="Calibri" w:hAnsi="Calibri"/>
+                <w:sz w:val="18"/>
+              </w:rPr>
+              <w:t>OneHUB</w:t>
+            </w:r>
+          </w:p>
+        </w:tc>
+        <w:tc>
+          <w:tcPr>
+            <w:tcW w:type="dxa" w:w="1568"/>
+          </w:tcPr>
+          <w:p>
+            <w:r/>
+            <w:r>
+              <w:rPr>
+                <w:rFonts w:ascii="Calibri" w:hAnsi="Calibri"/>
+                <w:sz w:val="18"/>
+              </w:rPr>
+              <w:t>Platform Configuration</w:t>
+            </w:r>
+          </w:p>
+        </w:tc>
+        <w:tc>
+          <w:tcPr>
+            <w:tcW w:type="dxa" w:w="1568"/>
+          </w:tcPr>
+          <w:p>
+            <w:r/>
+            <w:r>
+              <w:rPr>
+                <w:rFonts w:ascii="Calibri" w:hAnsi="Calibri"/>
+                <w:sz w:val="18"/>
+              </w:rPr>
+              <w:t>Unhide Org Chart</w:t>
+            </w:r>
+          </w:p>
+        </w:tc>
+        <w:tc>
+          <w:tcPr>
+            <w:tcW w:type="dxa" w:w="1568"/>
+          </w:tcPr>
+          <w:p>
+            <w:r/>
+            <w:r>
+              <w:rPr>
+                <w:rFonts w:ascii="Calibri" w:hAnsi="Calibri"/>
+                <w:sz w:val="18"/>
+              </w:rPr>
+              <w:t>RITM Resolution SLA(1 days)</w:t>
+            </w:r>
+          </w:p>
+        </w:tc>
+        <w:tc>
+          <w:tcPr>
+            <w:tcW w:type="dxa" w:w="1568"/>
+          </w:tcPr>
+          <w:p>
+            <w:r/>
+            <w:r>
+              <w:rPr>
+                <w:rFonts w:ascii="Calibri" w:hAnsi="Calibri"/>
                 <w:sz w:val="18"/>
               </w:rPr>
               <w:t>DGE HQ IT CDP OneHub Support</w:t>
@@ -7949,12 +8543,14 @@
       <w:tr>
         <w:tc>
           <w:tcPr>
-            <w:tcW w:type="dxa" w:w="1881"/>
-            <w:shd w:fill="E8F0FE" w:val="clear"/>
-          </w:tcPr>
-          <w:p>
-            <w:r>
-              <w:rPr>
+            <w:tcW w:type="dxa" w:w="1568"/>
+            <w:shd w:val="clear" w:color="auto" w:fill="D9E2F3"/>
+          </w:tcPr>
+          <w:p>
+            <w:r/>
+            <w:r>
+              <w:rPr>
+                <w:rFonts w:ascii="Calibri" w:hAnsi="Calibri"/>
                 <w:sz w:val="18"/>
               </w:rPr>
               <w:t>OneHub Service</w:t>
@@ -7963,54 +8559,78 @@
         </w:tc>
         <w:tc>
           <w:tcPr>
-            <w:tcW w:type="dxa" w:w="1881"/>
-            <w:shd w:fill="E8F0FE" w:val="clear"/>
-          </w:tcPr>
-          <w:p>
-            <w:r>
-              <w:rPr>
-                <w:sz w:val="18"/>
-              </w:rPr>
-              <w:t>General</w:t>
-            </w:r>
-          </w:p>
-        </w:tc>
-        <w:tc>
-          <w:tcPr>
-            <w:tcW w:type="dxa" w:w="1881"/>
-            <w:shd w:fill="E8F0FE" w:val="clear"/>
-          </w:tcPr>
-          <w:p>
-            <w:r>
-              <w:rPr>
-                <w:sz w:val="18"/>
-              </w:rPr>
-              <w:t>General Request</w:t>
-            </w:r>
-          </w:p>
-        </w:tc>
-        <w:tc>
-          <w:tcPr>
-            <w:tcW w:type="dxa" w:w="1881"/>
-            <w:shd w:fill="E8F0FE" w:val="clear"/>
-          </w:tcPr>
-          <w:p>
-            <w:r>
-              <w:rPr>
-                <w:sz w:val="18"/>
-              </w:rPr>
-              <w:t>2 days</w:t>
-            </w:r>
-          </w:p>
-        </w:tc>
-        <w:tc>
-          <w:tcPr>
-            <w:tcW w:type="dxa" w:w="1881"/>
-            <w:shd w:fill="E8F0FE" w:val="clear"/>
-          </w:tcPr>
-          <w:p>
-            <w:r>
-              <w:rPr>
+            <w:tcW w:type="dxa" w:w="1568"/>
+            <w:shd w:val="clear" w:color="auto" w:fill="D9E2F3"/>
+          </w:tcPr>
+          <w:p>
+            <w:r/>
+            <w:r>
+              <w:rPr>
+                <w:rFonts w:ascii="Calibri" w:hAnsi="Calibri"/>
+                <w:sz w:val="18"/>
+              </w:rPr>
+              <w:t>OneHUB</w:t>
+            </w:r>
+          </w:p>
+        </w:tc>
+        <w:tc>
+          <w:tcPr>
+            <w:tcW w:type="dxa" w:w="1568"/>
+            <w:shd w:val="clear" w:color="auto" w:fill="D9E2F3"/>
+          </w:tcPr>
+          <w:p>
+            <w:r/>
+            <w:r>
+              <w:rPr>
+                <w:rFonts w:ascii="Calibri" w:hAnsi="Calibri"/>
+                <w:sz w:val="18"/>
+              </w:rPr>
+              <w:t>Platform Configuration</w:t>
+            </w:r>
+          </w:p>
+        </w:tc>
+        <w:tc>
+          <w:tcPr>
+            <w:tcW w:type="dxa" w:w="1568"/>
+            <w:shd w:val="clear" w:color="auto" w:fill="D9E2F3"/>
+          </w:tcPr>
+          <w:p>
+            <w:r/>
+            <w:r>
+              <w:rPr>
+                <w:rFonts w:ascii="Calibri" w:hAnsi="Calibri"/>
+                <w:sz w:val="18"/>
+              </w:rPr>
+              <w:t>App Registration / Config Change</w:t>
+            </w:r>
+          </w:p>
+        </w:tc>
+        <w:tc>
+          <w:tcPr>
+            <w:tcW w:type="dxa" w:w="1568"/>
+            <w:shd w:val="clear" w:color="auto" w:fill="D9E2F3"/>
+          </w:tcPr>
+          <w:p>
+            <w:r/>
+            <w:r>
+              <w:rPr>
+                <w:rFonts w:ascii="Calibri" w:hAnsi="Calibri"/>
+                <w:sz w:val="18"/>
+              </w:rPr>
+              <w:t>RITM Resolution SLA(2 days)</w:t>
+            </w:r>
+          </w:p>
+        </w:tc>
+        <w:tc>
+          <w:tcPr>
+            <w:tcW w:type="dxa" w:w="1568"/>
+            <w:shd w:val="clear" w:color="auto" w:fill="D9E2F3"/>
+          </w:tcPr>
+          <w:p>
+            <w:r/>
+            <w:r>
+              <w:rPr>
+                <w:rFonts w:ascii="Calibri" w:hAnsi="Calibri"/>
                 <w:sz w:val="18"/>
               </w:rPr>
               <w:t>DGE HQ IT CDP OneHub Support</w:t>
@@ -8021,11 +8641,13 @@
       <w:tr>
         <w:tc>
           <w:tcPr>
-            <w:tcW w:type="dxa" w:w="1881"/>
-          </w:tcPr>
-          <w:p>
-            <w:r>
-              <w:rPr>
+            <w:tcW w:type="dxa" w:w="1568"/>
+          </w:tcPr>
+          <w:p>
+            <w:r/>
+            <w:r>
+              <w:rPr>
+                <w:rFonts w:ascii="Calibri" w:hAnsi="Calibri"/>
                 <w:sz w:val="18"/>
               </w:rPr>
               <w:t>OneHub Service</w:t>
@@ -8034,11 +8656,598 @@
         </w:tc>
         <w:tc>
           <w:tcPr>
-            <w:tcW w:type="dxa" w:w="1881"/>
-          </w:tcPr>
-          <w:p>
-            <w:r>
-              <w:rPr>
+            <w:tcW w:type="dxa" w:w="1568"/>
+          </w:tcPr>
+          <w:p>
+            <w:r/>
+            <w:r>
+              <w:rPr>
+                <w:rFonts w:ascii="Calibri" w:hAnsi="Calibri"/>
+                <w:sz w:val="18"/>
+              </w:rPr>
+              <w:t>OneHUB</w:t>
+            </w:r>
+          </w:p>
+        </w:tc>
+        <w:tc>
+          <w:tcPr>
+            <w:tcW w:type="dxa" w:w="1568"/>
+          </w:tcPr>
+          <w:p>
+            <w:r/>
+            <w:r>
+              <w:rPr>
+                <w:rFonts w:ascii="Calibri" w:hAnsi="Calibri"/>
+                <w:sz w:val="18"/>
+              </w:rPr>
+              <w:t>Integration &amp; Systems</w:t>
+            </w:r>
+          </w:p>
+        </w:tc>
+        <w:tc>
+          <w:tcPr>
+            <w:tcW w:type="dxa" w:w="1568"/>
+          </w:tcPr>
+          <w:p>
+            <w:r/>
+            <w:r>
+              <w:rPr>
+                <w:rFonts w:ascii="Calibri" w:hAnsi="Calibri"/>
+                <w:sz w:val="18"/>
+              </w:rPr>
+              <w:t>ADERP / ERP Integration Issue</w:t>
+            </w:r>
+          </w:p>
+        </w:tc>
+        <w:tc>
+          <w:tcPr>
+            <w:tcW w:type="dxa" w:w="1568"/>
+          </w:tcPr>
+          <w:p>
+            <w:r/>
+            <w:r>
+              <w:rPr>
+                <w:rFonts w:ascii="Calibri" w:hAnsi="Calibri"/>
+                <w:sz w:val="18"/>
+              </w:rPr>
+              <w:t>RITM Resolution SLA(2 days)</w:t>
+            </w:r>
+          </w:p>
+        </w:tc>
+        <w:tc>
+          <w:tcPr>
+            <w:tcW w:type="dxa" w:w="1568"/>
+          </w:tcPr>
+          <w:p>
+            <w:r/>
+            <w:r>
+              <w:rPr>
+                <w:rFonts w:ascii="Calibri" w:hAnsi="Calibri"/>
+                <w:sz w:val="18"/>
+              </w:rPr>
+              <w:t>DGE HQ IT CDP OneHub Support</w:t>
+            </w:r>
+          </w:p>
+        </w:tc>
+      </w:tr>
+      <w:tr>
+        <w:tc>
+          <w:tcPr>
+            <w:tcW w:type="dxa" w:w="1568"/>
+            <w:shd w:val="clear" w:color="auto" w:fill="D9E2F3"/>
+          </w:tcPr>
+          <w:p>
+            <w:r/>
+            <w:r>
+              <w:rPr>
+                <w:rFonts w:ascii="Calibri" w:hAnsi="Calibri"/>
+                <w:sz w:val="18"/>
+              </w:rPr>
+              <w:t>OneHub Service</w:t>
+            </w:r>
+          </w:p>
+        </w:tc>
+        <w:tc>
+          <w:tcPr>
+            <w:tcW w:type="dxa" w:w="1568"/>
+            <w:shd w:val="clear" w:color="auto" w:fill="D9E2F3"/>
+          </w:tcPr>
+          <w:p>
+            <w:r/>
+            <w:r>
+              <w:rPr>
+                <w:rFonts w:ascii="Calibri" w:hAnsi="Calibri"/>
+                <w:sz w:val="18"/>
+              </w:rPr>
+              <w:t>OneHUB</w:t>
+            </w:r>
+          </w:p>
+        </w:tc>
+        <w:tc>
+          <w:tcPr>
+            <w:tcW w:type="dxa" w:w="1568"/>
+            <w:shd w:val="clear" w:color="auto" w:fill="D9E2F3"/>
+          </w:tcPr>
+          <w:p>
+            <w:r/>
+            <w:r>
+              <w:rPr>
+                <w:rFonts w:ascii="Calibri" w:hAnsi="Calibri"/>
+                <w:sz w:val="18"/>
+              </w:rPr>
+              <w:t>Integration &amp; Systems</w:t>
+            </w:r>
+          </w:p>
+        </w:tc>
+        <w:tc>
+          <w:tcPr>
+            <w:tcW w:type="dxa" w:w="1568"/>
+            <w:shd w:val="clear" w:color="auto" w:fill="D9E2F3"/>
+          </w:tcPr>
+          <w:p>
+            <w:r/>
+            <w:r>
+              <w:rPr>
+                <w:rFonts w:ascii="Calibri" w:hAnsi="Calibri"/>
+                <w:sz w:val="18"/>
+              </w:rPr>
+              <w:t>Notification / Approval Sync Issue</w:t>
+            </w:r>
+          </w:p>
+        </w:tc>
+        <w:tc>
+          <w:tcPr>
+            <w:tcW w:type="dxa" w:w="1568"/>
+            <w:shd w:val="clear" w:color="auto" w:fill="D9E2F3"/>
+          </w:tcPr>
+          <w:p>
+            <w:r/>
+            <w:r>
+              <w:rPr>
+                <w:rFonts w:ascii="Calibri" w:hAnsi="Calibri"/>
+                <w:sz w:val="18"/>
+              </w:rPr>
+              <w:t>RITM Resolution SLA(1 days)</w:t>
+            </w:r>
+          </w:p>
+        </w:tc>
+        <w:tc>
+          <w:tcPr>
+            <w:tcW w:type="dxa" w:w="1568"/>
+            <w:shd w:val="clear" w:color="auto" w:fill="D9E2F3"/>
+          </w:tcPr>
+          <w:p>
+            <w:r/>
+            <w:r>
+              <w:rPr>
+                <w:rFonts w:ascii="Calibri" w:hAnsi="Calibri"/>
+                <w:sz w:val="18"/>
+              </w:rPr>
+              <w:t>DGE HQ IT CDP OneHub Support</w:t>
+            </w:r>
+          </w:p>
+        </w:tc>
+      </w:tr>
+      <w:tr>
+        <w:tc>
+          <w:tcPr>
+            <w:tcW w:type="dxa" w:w="1568"/>
+          </w:tcPr>
+          <w:p>
+            <w:r/>
+            <w:r>
+              <w:rPr>
+                <w:rFonts w:ascii="Calibri" w:hAnsi="Calibri"/>
+                <w:sz w:val="18"/>
+              </w:rPr>
+              <w:t>OneHub Service</w:t>
+            </w:r>
+          </w:p>
+        </w:tc>
+        <w:tc>
+          <w:tcPr>
+            <w:tcW w:type="dxa" w:w="1568"/>
+          </w:tcPr>
+          <w:p>
+            <w:r/>
+            <w:r>
+              <w:rPr>
+                <w:rFonts w:ascii="Calibri" w:hAnsi="Calibri"/>
+                <w:sz w:val="18"/>
+              </w:rPr>
+              <w:t>OneHUB</w:t>
+            </w:r>
+          </w:p>
+        </w:tc>
+        <w:tc>
+          <w:tcPr>
+            <w:tcW w:type="dxa" w:w="1568"/>
+          </w:tcPr>
+          <w:p>
+            <w:r/>
+            <w:r>
+              <w:rPr>
+                <w:rFonts w:ascii="Calibri" w:hAnsi="Calibri"/>
+                <w:sz w:val="18"/>
+              </w:rPr>
+              <w:t>Integration &amp; Systems</w:t>
+            </w:r>
+          </w:p>
+        </w:tc>
+        <w:tc>
+          <w:tcPr>
+            <w:tcW w:type="dxa" w:w="1568"/>
+          </w:tcPr>
+          <w:p>
+            <w:r/>
+            <w:r>
+              <w:rPr>
+                <w:rFonts w:ascii="Calibri" w:hAnsi="Calibri"/>
+                <w:sz w:val="18"/>
+              </w:rPr>
+              <w:t>Correspondence Management Issue</w:t>
+            </w:r>
+          </w:p>
+        </w:tc>
+        <w:tc>
+          <w:tcPr>
+            <w:tcW w:type="dxa" w:w="1568"/>
+          </w:tcPr>
+          <w:p>
+            <w:r/>
+            <w:r>
+              <w:rPr>
+                <w:rFonts w:ascii="Calibri" w:hAnsi="Calibri"/>
+                <w:sz w:val="18"/>
+              </w:rPr>
+              <w:t>RITM Resolution SLA(2 days)</w:t>
+            </w:r>
+          </w:p>
+        </w:tc>
+        <w:tc>
+          <w:tcPr>
+            <w:tcW w:type="dxa" w:w="1568"/>
+          </w:tcPr>
+          <w:p>
+            <w:r/>
+            <w:r>
+              <w:rPr>
+                <w:rFonts w:ascii="Calibri" w:hAnsi="Calibri"/>
+                <w:sz w:val="18"/>
+              </w:rPr>
+              <w:t>DGE HQ IT CDP OneHub Support</w:t>
+            </w:r>
+          </w:p>
+        </w:tc>
+      </w:tr>
+      <w:tr>
+        <w:tc>
+          <w:tcPr>
+            <w:tcW w:type="dxa" w:w="1568"/>
+            <w:shd w:val="clear" w:color="auto" w:fill="D9E2F3"/>
+          </w:tcPr>
+          <w:p>
+            <w:r/>
+            <w:r>
+              <w:rPr>
+                <w:rFonts w:ascii="Calibri" w:hAnsi="Calibri"/>
+                <w:sz w:val="18"/>
+              </w:rPr>
+              <w:t>OneHub Service</w:t>
+            </w:r>
+          </w:p>
+        </w:tc>
+        <w:tc>
+          <w:tcPr>
+            <w:tcW w:type="dxa" w:w="1568"/>
+            <w:shd w:val="clear" w:color="auto" w:fill="D9E2F3"/>
+          </w:tcPr>
+          <w:p>
+            <w:r/>
+            <w:r>
+              <w:rPr>
+                <w:rFonts w:ascii="Calibri" w:hAnsi="Calibri"/>
+                <w:sz w:val="18"/>
+              </w:rPr>
+              <w:t>OneHUB</w:t>
+            </w:r>
+          </w:p>
+        </w:tc>
+        <w:tc>
+          <w:tcPr>
+            <w:tcW w:type="dxa" w:w="1568"/>
+            <w:shd w:val="clear" w:color="auto" w:fill="D9E2F3"/>
+          </w:tcPr>
+          <w:p>
+            <w:r/>
+            <w:r>
+              <w:rPr>
+                <w:rFonts w:ascii="Calibri" w:hAnsi="Calibri"/>
+                <w:sz w:val="18"/>
+              </w:rPr>
+              <w:t>Integration &amp; Systems</w:t>
+            </w:r>
+          </w:p>
+        </w:tc>
+        <w:tc>
+          <w:tcPr>
+            <w:tcW w:type="dxa" w:w="1568"/>
+            <w:shd w:val="clear" w:color="auto" w:fill="D9E2F3"/>
+          </w:tcPr>
+          <w:p>
+            <w:r/>
+            <w:r>
+              <w:rPr>
+                <w:rFonts w:ascii="Calibri" w:hAnsi="Calibri"/>
+                <w:sz w:val="18"/>
+              </w:rPr>
+              <w:t>API / Configuration Change</w:t>
+            </w:r>
+          </w:p>
+        </w:tc>
+        <w:tc>
+          <w:tcPr>
+            <w:tcW w:type="dxa" w:w="1568"/>
+            <w:shd w:val="clear" w:color="auto" w:fill="D9E2F3"/>
+          </w:tcPr>
+          <w:p>
+            <w:r/>
+            <w:r>
+              <w:rPr>
+                <w:rFonts w:ascii="Calibri" w:hAnsi="Calibri"/>
+                <w:sz w:val="18"/>
+              </w:rPr>
+              <w:t>RITM Resolution SLA(4 days)</w:t>
+            </w:r>
+          </w:p>
+        </w:tc>
+        <w:tc>
+          <w:tcPr>
+            <w:tcW w:type="dxa" w:w="1568"/>
+            <w:shd w:val="clear" w:color="auto" w:fill="D9E2F3"/>
+          </w:tcPr>
+          <w:p>
+            <w:r/>
+            <w:r>
+              <w:rPr>
+                <w:rFonts w:ascii="Calibri" w:hAnsi="Calibri"/>
+                <w:sz w:val="18"/>
+              </w:rPr>
+              <w:t>DGE HQ IT CDP OneHub Support</w:t>
+            </w:r>
+          </w:p>
+        </w:tc>
+      </w:tr>
+      <w:tr>
+        <w:tc>
+          <w:tcPr>
+            <w:tcW w:type="dxa" w:w="1568"/>
+          </w:tcPr>
+          <w:p>
+            <w:r/>
+            <w:r>
+              <w:rPr>
+                <w:rFonts w:ascii="Calibri" w:hAnsi="Calibri"/>
+                <w:sz w:val="18"/>
+              </w:rPr>
+              <w:t>OneHub Service</w:t>
+            </w:r>
+          </w:p>
+        </w:tc>
+        <w:tc>
+          <w:tcPr>
+            <w:tcW w:type="dxa" w:w="1568"/>
+          </w:tcPr>
+          <w:p>
+            <w:r/>
+            <w:r>
+              <w:rPr>
+                <w:rFonts w:ascii="Calibri" w:hAnsi="Calibri"/>
+                <w:sz w:val="18"/>
+              </w:rPr>
+              <w:t>OneHUB</w:t>
+            </w:r>
+          </w:p>
+        </w:tc>
+        <w:tc>
+          <w:tcPr>
+            <w:tcW w:type="dxa" w:w="1568"/>
+          </w:tcPr>
+          <w:p>
+            <w:r/>
+            <w:r>
+              <w:rPr>
+                <w:rFonts w:ascii="Calibri" w:hAnsi="Calibri"/>
+                <w:sz w:val="18"/>
+              </w:rPr>
+              <w:t>Mobile Application</w:t>
+            </w:r>
+          </w:p>
+        </w:tc>
+        <w:tc>
+          <w:tcPr>
+            <w:tcW w:type="dxa" w:w="1568"/>
+          </w:tcPr>
+          <w:p>
+            <w:r/>
+            <w:r>
+              <w:rPr>
+                <w:rFonts w:ascii="Calibri" w:hAnsi="Calibri"/>
+                <w:sz w:val="18"/>
+              </w:rPr>
+              <w:t>Mobile App Issue</w:t>
+            </w:r>
+          </w:p>
+        </w:tc>
+        <w:tc>
+          <w:tcPr>
+            <w:tcW w:type="dxa" w:w="1568"/>
+          </w:tcPr>
+          <w:p>
+            <w:r/>
+            <w:r>
+              <w:rPr>
+                <w:rFonts w:ascii="Calibri" w:hAnsi="Calibri"/>
+                <w:sz w:val="18"/>
+              </w:rPr>
+              <w:t>RITM Resolution SLA(1 days)</w:t>
+            </w:r>
+          </w:p>
+        </w:tc>
+        <w:tc>
+          <w:tcPr>
+            <w:tcW w:type="dxa" w:w="1568"/>
+          </w:tcPr>
+          <w:p>
+            <w:r/>
+            <w:r>
+              <w:rPr>
+                <w:rFonts w:ascii="Calibri" w:hAnsi="Calibri"/>
+                <w:sz w:val="18"/>
+              </w:rPr>
+              <w:t>DGE HQ IT CDP OneHub Support</w:t>
+            </w:r>
+          </w:p>
+        </w:tc>
+      </w:tr>
+      <w:tr>
+        <w:tc>
+          <w:tcPr>
+            <w:tcW w:type="dxa" w:w="1568"/>
+            <w:shd w:val="clear" w:color="auto" w:fill="D9E2F3"/>
+          </w:tcPr>
+          <w:p>
+            <w:r/>
+            <w:r>
+              <w:rPr>
+                <w:rFonts w:ascii="Calibri" w:hAnsi="Calibri"/>
+                <w:sz w:val="18"/>
+              </w:rPr>
+              <w:t>OneHub Service</w:t>
+            </w:r>
+          </w:p>
+        </w:tc>
+        <w:tc>
+          <w:tcPr>
+            <w:tcW w:type="dxa" w:w="1568"/>
+            <w:shd w:val="clear" w:color="auto" w:fill="D9E2F3"/>
+          </w:tcPr>
+          <w:p>
+            <w:r/>
+            <w:r>
+              <w:rPr>
+                <w:rFonts w:ascii="Calibri" w:hAnsi="Calibri"/>
+                <w:sz w:val="18"/>
+              </w:rPr>
+              <w:t>OneHUB</w:t>
+            </w:r>
+          </w:p>
+        </w:tc>
+        <w:tc>
+          <w:tcPr>
+            <w:tcW w:type="dxa" w:w="1568"/>
+            <w:shd w:val="clear" w:color="auto" w:fill="D9E2F3"/>
+          </w:tcPr>
+          <w:p>
+            <w:r/>
+            <w:r>
+              <w:rPr>
+                <w:rFonts w:ascii="Calibri" w:hAnsi="Calibri"/>
+                <w:sz w:val="18"/>
+              </w:rPr>
+              <w:t>Mobile Application</w:t>
+            </w:r>
+          </w:p>
+        </w:tc>
+        <w:tc>
+          <w:tcPr>
+            <w:tcW w:type="dxa" w:w="1568"/>
+            <w:shd w:val="clear" w:color="auto" w:fill="D9E2F3"/>
+          </w:tcPr>
+          <w:p>
+            <w:r/>
+            <w:r>
+              <w:rPr>
+                <w:rFonts w:ascii="Calibri" w:hAnsi="Calibri"/>
+                <w:sz w:val="18"/>
+              </w:rPr>
+              <w:t>Mobile Login Issue</w:t>
+            </w:r>
+          </w:p>
+        </w:tc>
+        <w:tc>
+          <w:tcPr>
+            <w:tcW w:type="dxa" w:w="1568"/>
+            <w:shd w:val="clear" w:color="auto" w:fill="D9E2F3"/>
+          </w:tcPr>
+          <w:p>
+            <w:r/>
+            <w:r>
+              <w:rPr>
+                <w:rFonts w:ascii="Calibri" w:hAnsi="Calibri"/>
+                <w:sz w:val="18"/>
+              </w:rPr>
+              <w:t>RITM Resolution SLA(1 days)</w:t>
+            </w:r>
+          </w:p>
+        </w:tc>
+        <w:tc>
+          <w:tcPr>
+            <w:tcW w:type="dxa" w:w="1568"/>
+            <w:shd w:val="clear" w:color="auto" w:fill="D9E2F3"/>
+          </w:tcPr>
+          <w:p>
+            <w:r/>
+            <w:r>
+              <w:rPr>
+                <w:rFonts w:ascii="Calibri" w:hAnsi="Calibri"/>
+                <w:sz w:val="18"/>
+              </w:rPr>
+              <w:t>DGE HQ IT CDP OneHub Support</w:t>
+            </w:r>
+          </w:p>
+        </w:tc>
+      </w:tr>
+      <w:tr>
+        <w:tc>
+          <w:tcPr>
+            <w:tcW w:type="dxa" w:w="1568"/>
+          </w:tcPr>
+          <w:p>
+            <w:r/>
+            <w:r>
+              <w:rPr>
+                <w:rFonts w:ascii="Calibri" w:hAnsi="Calibri"/>
+                <w:sz w:val="18"/>
+              </w:rPr>
+              <w:t>OneHub Service</w:t>
+            </w:r>
+          </w:p>
+        </w:tc>
+        <w:tc>
+          <w:tcPr>
+            <w:tcW w:type="dxa" w:w="1568"/>
+          </w:tcPr>
+          <w:p>
+            <w:r/>
+            <w:r>
+              <w:rPr>
+                <w:rFonts w:ascii="Calibri" w:hAnsi="Calibri"/>
+                <w:sz w:val="18"/>
+              </w:rPr>
+              <w:t>OneHUB</w:t>
+            </w:r>
+          </w:p>
+        </w:tc>
+        <w:tc>
+          <w:tcPr>
+            <w:tcW w:type="dxa" w:w="1568"/>
+          </w:tcPr>
+          <w:p>
+            <w:r/>
+            <w:r>
+              <w:rPr>
+                <w:rFonts w:ascii="Calibri" w:hAnsi="Calibri"/>
                 <w:sz w:val="18"/>
               </w:rPr>
               <w:t>General</w:t>
@@ -8047,11 +9256,109 @@
         </w:tc>
         <w:tc>
           <w:tcPr>
-            <w:tcW w:type="dxa" w:w="1881"/>
-          </w:tcPr>
-          <w:p>
-            <w:r>
-              <w:rPr>
+            <w:tcW w:type="dxa" w:w="1568"/>
+          </w:tcPr>
+          <w:p>
+            <w:r/>
+            <w:r>
+              <w:rPr>
+                <w:rFonts w:ascii="Calibri" w:hAnsi="Calibri"/>
+                <w:sz w:val="18"/>
+              </w:rPr>
+              <w:t>General Request</w:t>
+            </w:r>
+          </w:p>
+        </w:tc>
+        <w:tc>
+          <w:tcPr>
+            <w:tcW w:type="dxa" w:w="1568"/>
+          </w:tcPr>
+          <w:p>
+            <w:r/>
+            <w:r>
+              <w:rPr>
+                <w:rFonts w:ascii="Calibri" w:hAnsi="Calibri"/>
+                <w:sz w:val="18"/>
+              </w:rPr>
+              <w:t>RITM Resolution SLA(2 days)</w:t>
+            </w:r>
+          </w:p>
+        </w:tc>
+        <w:tc>
+          <w:tcPr>
+            <w:tcW w:type="dxa" w:w="1568"/>
+          </w:tcPr>
+          <w:p>
+            <w:r/>
+            <w:r>
+              <w:rPr>
+                <w:rFonts w:ascii="Calibri" w:hAnsi="Calibri"/>
+                <w:sz w:val="18"/>
+              </w:rPr>
+              <w:t>DGE HQ IT CDP OneHub Support</w:t>
+            </w:r>
+          </w:p>
+        </w:tc>
+      </w:tr>
+      <w:tr>
+        <w:tc>
+          <w:tcPr>
+            <w:tcW w:type="dxa" w:w="1568"/>
+            <w:shd w:val="clear" w:color="auto" w:fill="D9E2F3"/>
+          </w:tcPr>
+          <w:p>
+            <w:r/>
+            <w:r>
+              <w:rPr>
+                <w:rFonts w:ascii="Calibri" w:hAnsi="Calibri"/>
+                <w:sz w:val="18"/>
+              </w:rPr>
+              <w:t>OneHub Service</w:t>
+            </w:r>
+          </w:p>
+        </w:tc>
+        <w:tc>
+          <w:tcPr>
+            <w:tcW w:type="dxa" w:w="1568"/>
+            <w:shd w:val="clear" w:color="auto" w:fill="D9E2F3"/>
+          </w:tcPr>
+          <w:p>
+            <w:r/>
+            <w:r>
+              <w:rPr>
+                <w:rFonts w:ascii="Calibri" w:hAnsi="Calibri"/>
+                <w:sz w:val="18"/>
+              </w:rPr>
+              <w:t>OneHUB</w:t>
+            </w:r>
+          </w:p>
+        </w:tc>
+        <w:tc>
+          <w:tcPr>
+            <w:tcW w:type="dxa" w:w="1568"/>
+            <w:shd w:val="clear" w:color="auto" w:fill="D9E2F3"/>
+          </w:tcPr>
+          <w:p>
+            <w:r/>
+            <w:r>
+              <w:rPr>
+                <w:rFonts w:ascii="Calibri" w:hAnsi="Calibri"/>
+                <w:sz w:val="18"/>
+              </w:rPr>
+              <w:t>General</w:t>
+            </w:r>
+          </w:p>
+        </w:tc>
+        <w:tc>
+          <w:tcPr>
+            <w:tcW w:type="dxa" w:w="1568"/>
+            <w:shd w:val="clear" w:color="auto" w:fill="D9E2F3"/>
+          </w:tcPr>
+          <w:p>
+            <w:r/>
+            <w:r>
+              <w:rPr>
+                <w:rFonts w:ascii="Calibri" w:hAnsi="Calibri"/>
                 <w:sz w:val="18"/>
               </w:rPr>
               <w:t>New Service Request</w:t>
@@ -8060,24 +9367,30 @@
         </w:tc>
         <w:tc>
           <w:tcPr>
-            <w:tcW w:type="dxa" w:w="1881"/>
-          </w:tcPr>
-          <w:p>
-            <w:r>
-              <w:rPr>
-                <w:sz w:val="18"/>
-              </w:rPr>
-              <w:t>4 days</w:t>
-            </w:r>
-          </w:p>
-        </w:tc>
-        <w:tc>
-          <w:tcPr>
-            <w:tcW w:type="dxa" w:w="1881"/>
-          </w:tcPr>
-          <w:p>
-            <w:r>
-              <w:rPr>
+            <w:tcW w:type="dxa" w:w="1568"/>
+            <w:shd w:val="clear" w:color="auto" w:fill="D9E2F3"/>
+          </w:tcPr>
+          <w:p>
+            <w:r/>
+            <w:r>
+              <w:rPr>
+                <w:rFonts w:ascii="Calibri" w:hAnsi="Calibri"/>
+                <w:sz w:val="18"/>
+              </w:rPr>
+              <w:t>RITM Resolution SLA(4 days)</w:t>
+            </w:r>
+          </w:p>
+        </w:tc>
+        <w:tc>
+          <w:tcPr>
+            <w:tcW w:type="dxa" w:w="1568"/>
+            <w:shd w:val="clear" w:color="auto" w:fill="D9E2F3"/>
+          </w:tcPr>
+          <w:p>
+            <w:r/>
+            <w:r>
+              <w:rPr>
+                <w:rFonts w:ascii="Calibri" w:hAnsi="Calibri"/>
                 <w:sz w:val="18"/>
               </w:rPr>
               <w:t>DGE HQ IT CDP OneHub Support</w:t>

</xml_diff>

<commit_message>
Replace 'Issue' with service-request terminology in all catalog action names
Renamed 12 action items across CSV, Word doc, and Excel:
- 'Issue' replaced with 'Request', 'Support', or action-oriented terms
- All three files verified in sync (32 items, 0 remaining 'Issue' terms)

Agent-Logs-Url: https://github.com/SupportAshjar/training-survey-data/sessions/e7f2b49e-bc99-4a74-98e2-d02ee269969e

Co-authored-by: SupportAshjar <269141587+SupportAshjar@users.noreply.github.com>
</commit_message>
<xml_diff>
--- a/OneHub_Service_Request_Incident_Analysis_Report.docx
+++ b/OneHub_Service_Request_Incident_Analysis_Report.docx
@@ -6416,7 +6416,7 @@
                 <w:rFonts w:ascii="Calibri" w:hAnsi="Calibri"/>
                 <w:sz w:val="18"/>
               </w:rPr>
-              <w:t>Login / Access Issue</w:t>
+              <w:t>Login / Access Request</w:t>
             </w:r>
           </w:p>
         </w:tc>
@@ -6986,7 +6986,7 @@
                 <w:rFonts w:ascii="Calibri" w:hAnsi="Calibri"/>
                 <w:sz w:val="18"/>
               </w:rPr>
-              <w:t>Check-In / Drive Safely Issue</w:t>
+              <w:t>Check-In / Drive Safely Request</w:t>
             </w:r>
           </w:p>
         </w:tc>
@@ -7176,7 +7176,7 @@
                 <w:rFonts w:ascii="Calibri" w:hAnsi="Calibri"/>
                 <w:sz w:val="18"/>
               </w:rPr>
-              <w:t>Leave Request Issue</w:t>
+              <w:t>Leave Application Support</w:t>
             </w:r>
           </w:p>
         </w:tc>
@@ -7366,7 +7366,7 @@
                 <w:rFonts w:ascii="Calibri" w:hAnsi="Calibri"/>
                 <w:sz w:val="18"/>
               </w:rPr>
-              <w:t>Approval Workflow Issue</w:t>
+              <w:t>Approval Workflow Request</w:t>
             </w:r>
           </w:p>
         </w:tc>
@@ -7556,7 +7556,7 @@
                 <w:rFonts w:ascii="Calibri" w:hAnsi="Calibri"/>
                 <w:sz w:val="18"/>
               </w:rPr>
-              <w:t>Employee Contract Issue</w:t>
+              <w:t>Employee Contract Request</w:t>
             </w:r>
           </w:p>
         </w:tc>
@@ -7842,7 +7842,7 @@
                 <w:rFonts w:ascii="Calibri" w:hAnsi="Calibri"/>
                 <w:sz w:val="18"/>
               </w:rPr>
-              <w:t>Pay Slip Issue</w:t>
+              <w:t>Pay Slip Request</w:t>
             </w:r>
           </w:p>
         </w:tc>
@@ -7936,7 +7936,7 @@
                 <w:rFonts w:ascii="Calibri" w:hAnsi="Calibri"/>
                 <w:sz w:val="18"/>
               </w:rPr>
-              <w:t>Performance / Evaluation Issue</w:t>
+              <w:t>Performance / Evaluation Request</w:t>
             </w:r>
           </w:p>
         </w:tc>
@@ -8695,7 +8695,7 @@
                 <w:rFonts w:ascii="Calibri" w:hAnsi="Calibri"/>
                 <w:sz w:val="18"/>
               </w:rPr>
-              <w:t>ADERP / ERP Integration Issue</w:t>
+              <w:t>ADERP / ERP Integration Request</w:t>
             </w:r>
           </w:p>
         </w:tc>
@@ -8791,7 +8791,7 @@
                 <w:rFonts w:ascii="Calibri" w:hAnsi="Calibri"/>
                 <w:sz w:val="18"/>
               </w:rPr>
-              <w:t>Notification / Approval Sync Issue</w:t>
+              <w:t>Notification / Approval Sync Request</w:t>
             </w:r>
           </w:p>
         </w:tc>
@@ -8885,7 +8885,7 @@
                 <w:rFonts w:ascii="Calibri" w:hAnsi="Calibri"/>
                 <w:sz w:val="18"/>
               </w:rPr>
-              <w:t>Correspondence Management Issue</w:t>
+              <w:t>Correspondence Management Request</w:t>
             </w:r>
           </w:p>
         </w:tc>
@@ -9075,7 +9075,7 @@
                 <w:rFonts w:ascii="Calibri" w:hAnsi="Calibri"/>
                 <w:sz w:val="18"/>
               </w:rPr>
-              <w:t>Mobile App Issue</w:t>
+              <w:t>Mobile App Support</w:t>
             </w:r>
           </w:p>
         </w:tc>
@@ -9171,7 +9171,7 @@
                 <w:rFonts w:ascii="Calibri" w:hAnsi="Calibri"/>
                 <w:sz w:val="18"/>
               </w:rPr>
-              <w:t>Mobile Login Issue</w:t>
+              <w:t>Mobile Login Request</w:t>
             </w:r>
           </w:p>
         </w:tc>

</xml_diff>

<commit_message>
Add Description and Prerequisites fields to Service Request Catalog; enhance Incident descriptions
- Added 'Description' and 'Prerequisites' columns to all 32 Service Request
  Catalog items across CSV, Excel, and Word document (Table 8)
- Descriptions derived from OneHub User Manual, Features Overview, and actual
  request/incident data analysis
- Prerequisites specify what users need before submitting each request type
- Enhanced 17 incident sub-category descriptions in Word Table 7 with detailed
  explanations

Agent-Logs-Url: https://github.com/SupportAshjar/training-survey-data/sessions/434338c6-f599-4df5-92d3-b1e6be420df5

Co-authored-by: SupportAshjar <269141587+SupportAshjar@users.noreply.github.com>
</commit_message>
<xml_diff>
--- a/OneHub_Service_Request_Incident_Analysis_Report.docx
+++ b/OneHub_Service_Request_Incident_Analysis_Report.docx
@@ -4444,11 +4444,13 @@
             <w:tcW w:type="dxa" w:w="1881"/>
           </w:tcPr>
           <w:p>
-            <w:r>
-              <w:rPr>
-                <w:sz w:val="18"/>
-              </w:rPr>
-              <w:t>Automated K8s container restart alerts</w:t>
+            <w:r/>
+            <w:r>
+              <w:rPr>
+                <w:rFonts w:ascii="Calibri" w:hAnsi="Calibri"/>
+                <w:sz w:val="18"/>
+              </w:rPr>
+              <w:t>Automated alerts triggered when OneHub Kubernetes containers restart unexpectedly, indicating platform stability issues.</w:t>
             </w:r>
           </w:p>
         </w:tc>
@@ -4515,11 +4517,13 @@
             <w:shd w:fill="E8F0FE" w:val="clear"/>
           </w:tcPr>
           <w:p>
-            <w:r>
-              <w:rPr>
-                <w:sz w:val="18"/>
-              </w:rPr>
-              <w:t>Synthetic monitoring — clickpath failures</w:t>
+            <w:r/>
+            <w:r>
+              <w:rPr>
+                <w:rFonts w:ascii="Calibri" w:hAnsi="Calibri"/>
+                <w:sz w:val="18"/>
+              </w:rPr>
+              <w:t>Synthetic monitoring alerts for failed browser clickpath tests, indicating OneHub web availability degradation.</w:t>
             </w:r>
           </w:p>
         </w:tc>
@@ -4581,11 +4585,13 @@
             <w:tcW w:type="dxa" w:w="1881"/>
           </w:tcPr>
           <w:p>
-            <w:r>
-              <w:rPr>
-                <w:sz w:val="18"/>
-              </w:rPr>
-              <w:t>JavaScript error rate increases</w:t>
+            <w:r/>
+            <w:r>
+              <w:rPr>
+                <w:rFonts w:ascii="Calibri" w:hAnsi="Calibri"/>
+                <w:sz w:val="18"/>
+              </w:rPr>
+              <w:t>Alerts for increased JavaScript error rates in the OneHub web application affecting user experience.</w:t>
             </w:r>
           </w:p>
         </w:tc>
@@ -4652,11 +4658,13 @@
             <w:shd w:fill="E8F0FE" w:val="clear"/>
           </w:tcPr>
           <w:p>
-            <w:r>
-              <w:rPr>
-                <w:sz w:val="18"/>
-              </w:rPr>
-              <w:t>Long GC pauses affecting performance</w:t>
+            <w:r/>
+            <w:r>
+              <w:rPr>
+                <w:rFonts w:ascii="Calibri" w:hAnsi="Calibri"/>
+                <w:sz w:val="18"/>
+              </w:rPr>
+              <w:t>Alerts for long garbage collection pauses in the application server, causing performance degradation.</w:t>
             </w:r>
           </w:p>
         </w:tc>
@@ -4718,11 +4726,13 @@
             <w:tcW w:type="dxa" w:w="1881"/>
           </w:tcPr>
           <w:p>
-            <w:r>
-              <w:rPr>
-                <w:sz w:val="18"/>
-              </w:rPr>
-              <w:t>HTML element errors, HTTP failures</w:t>
+            <w:r/>
+            <w:r>
+              <w:rPr>
+                <w:rFonts w:ascii="Calibri" w:hAnsi="Calibri"/>
+                <w:sz w:val="18"/>
+              </w:rPr>
+              <w:t>HTTP error responses (502, 1502, etc.) from OneHub APIs or backend services indicating server-side failures.</w:t>
             </w:r>
           </w:p>
         </w:tc>
@@ -4855,11 +4865,13 @@
             <w:tcW w:type="dxa" w:w="1881"/>
           </w:tcPr>
           <w:p>
-            <w:r>
-              <w:rPr>
-                <w:sz w:val="18"/>
-              </w:rPr>
-              <w:t>Users cannot log in or access OneHub</w:t>
+            <w:r/>
+            <w:r>
+              <w:rPr>
+                <w:rFonts w:ascii="Calibri" w:hAnsi="Calibri"/>
+                <w:sz w:val="18"/>
+              </w:rPr>
+              <w:t>Users unable to log in to OneHub via web or mobile due to credential errors, session issues, or system unavailability.</w:t>
             </w:r>
           </w:p>
         </w:tc>
@@ -4926,11 +4938,13 @@
             <w:shd w:fill="E8F0FE" w:val="clear"/>
           </w:tcPr>
           <w:p>
-            <w:r>
-              <w:rPr>
-                <w:sz w:val="18"/>
-              </w:rPr>
-              <w:t>MFA reset, device change, authenticator</w:t>
+            <w:r/>
+            <w:r>
+              <w:rPr>
+                <w:rFonts w:ascii="Calibri" w:hAnsi="Calibri"/>
+                <w:sz w:val="18"/>
+              </w:rPr>
+              <w:t>Multi-factor authentication failures including authenticator app errors, device migration problems, and verification code issues.</w:t>
             </w:r>
           </w:p>
         </w:tc>
@@ -4992,11 +5006,13 @@
             <w:tcW w:type="dxa" w:w="1881"/>
           </w:tcPr>
           <w:p>
-            <w:r>
-              <w:rPr>
-                <w:sz w:val="18"/>
-              </w:rPr>
-              <w:t>Wrong account linked to user</w:t>
+            <w:r/>
+            <w:r>
+              <w:rPr>
+                <w:rFonts w:ascii="Calibri" w:hAnsi="Calibri"/>
+                <w:sz w:val="18"/>
+              </w:rPr>
+              <w:t>Incidents where the user's account is linked to the wrong entity, role, or person in the system.</w:t>
             </w:r>
           </w:p>
         </w:tc>
@@ -5063,11 +5079,13 @@
             <w:shd w:fill="E8F0FE" w:val="clear"/>
           </w:tcPr>
           <w:p>
-            <w:r>
-              <w:rPr>
-                <w:sz w:val="18"/>
-              </w:rPr>
-              <w:t>Profile data, manager mapping, location</w:t>
+            <w:r/>
+            <w:r>
+              <w:rPr>
+                <w:rFonts w:ascii="Calibri" w:hAnsi="Calibri"/>
+                <w:sz w:val="18"/>
+              </w:rPr>
+              <w:t>Profile data discrepancies including incorrect manager mapping, wrong location, or missing employee details.</w:t>
             </w:r>
           </w:p>
         </w:tc>
@@ -5200,11 +5218,13 @@
             <w:shd w:fill="E8F0FE" w:val="clear"/>
           </w:tcPr>
           <w:p>
-            <w:r>
-              <w:rPr>
-                <w:sz w:val="18"/>
-              </w:rPr>
-              <w:t>Attendance violations, missing swipes</w:t>
+            <w:r/>
+            <w:r>
+              <w:rPr>
+                <w:rFonts w:ascii="Calibri" w:hAnsi="Calibri"/>
+                <w:sz w:val="18"/>
+              </w:rPr>
+              <w:t>Attendance system incidents including erroneous violations, missing swipe records, and failed check-in/check-out.</w:t>
             </w:r>
           </w:p>
         </w:tc>
@@ -5337,11 +5357,13 @@
             <w:shd w:fill="E8F0FE" w:val="clear"/>
           </w:tcPr>
           <w:p>
-            <w:r>
-              <w:rPr>
-                <w:sz w:val="18"/>
-              </w:rPr>
-              <w:t>Leave submission, permission requests</w:t>
+            <w:r/>
+            <w:r>
+              <w:rPr>
+                <w:rFonts w:ascii="Calibri" w:hAnsi="Calibri"/>
+                <w:sz w:val="18"/>
+              </w:rPr>
+              <w:t>Incidents related to leave submission failures, permission request errors, or leave balance discrepancies.</w:t>
             </w:r>
           </w:p>
         </w:tc>
@@ -5403,11 +5425,13 @@
             <w:tcW w:type="dxa" w:w="1881"/>
           </w:tcPr>
           <w:p>
-            <w:r>
-              <w:rPr>
-                <w:sz w:val="18"/>
-              </w:rPr>
-              <w:t>Salary certificates, contract issues</w:t>
+            <w:r/>
+            <w:r>
+              <w:rPr>
+                <w:rFonts w:ascii="Calibri" w:hAnsi="Calibri"/>
+                <w:sz w:val="18"/>
+              </w:rPr>
+              <w:t>Incidents related to salary certificate generation failures, contract viewing errors, or pay slip access problems.</w:t>
             </w:r>
           </w:p>
         </w:tc>
@@ -5540,11 +5564,13 @@
             <w:tcW w:type="dxa" w:w="1881"/>
           </w:tcPr>
           <w:p>
-            <w:r>
-              <w:rPr>
-                <w:sz w:val="18"/>
-              </w:rPr>
-              <w:t>App not working, mobile-specific bugs</w:t>
+            <w:r/>
+            <w:r>
+              <w:rPr>
+                <w:rFonts w:ascii="Calibri" w:hAnsi="Calibri"/>
+                <w:sz w:val="18"/>
+              </w:rPr>
+              <w:t>OneHub mobile application incidents including crashes, installation failures, loading errors, and feature malfunctions.</w:t>
             </w:r>
           </w:p>
         </w:tc>
@@ -5677,11 +5703,13 @@
             <w:tcW w:type="dxa" w:w="1881"/>
           </w:tcPr>
           <w:p>
-            <w:r>
-              <w:rPr>
-                <w:sz w:val="18"/>
-              </w:rPr>
-              <w:t>Integration sync failures, ERP errors</w:t>
+            <w:r/>
+            <w:r>
+              <w:rPr>
+                <w:rFonts w:ascii="Calibri" w:hAnsi="Calibri"/>
+                <w:sz w:val="18"/>
+              </w:rPr>
+              <w:t>Data synchronization failures between OneHub and ADERP/Oracle Fusion affecting HR, finance, or attendance data.</w:t>
             </w:r>
           </w:p>
         </w:tc>
@@ -5814,11 +5842,13 @@
             <w:tcW w:type="dxa" w:w="1881"/>
           </w:tcPr>
           <w:p>
-            <w:r>
-              <w:rPr>
-                <w:sz w:val="18"/>
-              </w:rPr>
-              <w:t>Drive Safely feature-specific issues</w:t>
+            <w:r/>
+            <w:r>
+              <w:rPr>
+                <w:rFonts w:ascii="Calibri" w:hAnsi="Calibri"/>
+                <w:sz w:val="18"/>
+              </w:rPr>
+              <w:t>Incidents specific to the Drive Safely geolocation check-in feature, including GPS detection and distance calculation errors.</w:t>
             </w:r>
           </w:p>
         </w:tc>
@@ -5951,11 +5981,13 @@
             <w:tcW w:type="dxa" w:w="1881"/>
           </w:tcPr>
           <w:p>
-            <w:r>
-              <w:rPr>
-                <w:sz w:val="18"/>
-              </w:rPr>
-              <w:t>Vague "not working", "error" descriptions</w:t>
+            <w:r/>
+            <w:r>
+              <w:rPr>
+                <w:rFonts w:ascii="Calibri" w:hAnsi="Calibri"/>
+                <w:sz w:val="18"/>
+              </w:rPr>
+              <w:t>Vaguely described incidents such as 'not working' or 'error' that lack specific categorization details.</w:t>
             </w:r>
           </w:p>
         </w:tc>
@@ -6022,11 +6054,13 @@
             <w:shd w:fill="E8F0FE" w:val="clear"/>
           </w:tcPr>
           <w:p>
-            <w:r>
-              <w:rPr>
-                <w:sz w:val="18"/>
-              </w:rPr>
-              <w:t>Generic "OneHub issue" or minimal info</w:t>
+            <w:r/>
+            <w:r>
+              <w:rPr>
+                <w:rFonts w:ascii="Calibri" w:hAnsi="Calibri"/>
+                <w:sz w:val="18"/>
+              </w:rPr>
+              <w:t>Generic incidents described as 'OneHub issue' or with minimal information insufficient for specific categorization.</w:t>
             </w:r>
           </w:p>
         </w:tc>
@@ -6231,7 +6265,7 @@
           <w:rFonts w:ascii="Calibri" w:hAnsi="Calibri"/>
           <w:sz w:val="22"/>
         </w:rPr>
-        <w:t>Based on the analysis above, the following enhanced catalog structure is recommended. This replaces the current flat 8-item catalog with a hierarchical structure of 32 items across 8 categories that reflects actual user demand patterns. All items now have SLA targets defined.</w:t>
+        <w:t>Based on the analysis above, the following enhanced catalog structure is recommended. This replaces the current flat 8-item catalog with a hierarchical structure of 32 items across 8 categories that reflects actual user demand patterns. All items now have SLA targets defined. Each item includes a description and, for service requests, user prerequisites.</w:t>
       </w:r>
     </w:p>
     <w:tbl>
@@ -6248,6 +6282,8 @@
         <w:gridCol w:w="1568"/>
         <w:gridCol w:w="1568"/>
         <w:gridCol w:w="1568"/>
+        <w:gridCol w:w="2000"/>
+        <w:gridCol w:w="2000"/>
       </w:tblGrid>
       <w:tr>
         <w:tc>
@@ -6358,6 +6394,36 @@
             </w:r>
           </w:p>
         </w:tc>
+        <w:tc>
+          <w:p>
+            <w:pPr>
+              <w:jc w:val="center"/>
+            </w:pPr>
+            <w:r>
+              <w:rPr>
+                <w:b/>
+                <w:sz w:val="18"/>
+                <w:rFonts w:ascii="Calibri" w:hAnsi="Calibri"/>
+              </w:rPr>
+              <w:t>Description</w:t>
+            </w:r>
+          </w:p>
+        </w:tc>
+        <w:tc>
+          <w:p>
+            <w:pPr>
+              <w:jc w:val="center"/>
+            </w:pPr>
+            <w:r>
+              <w:rPr>
+                <w:b/>
+                <w:sz w:val="18"/>
+                <w:rFonts w:ascii="Calibri" w:hAnsi="Calibri"/>
+              </w:rPr>
+              <w:t>Prerequisites</w:t>
+            </w:r>
+          </w:p>
+        </w:tc>
       </w:tr>
       <w:tr>
         <w:tc>
@@ -6450,6 +6516,28 @@
             </w:r>
           </w:p>
         </w:tc>
+        <w:tc>
+          <w:p>
+            <w:r>
+              <w:rPr>
+                <w:sz w:val="16"/>
+                <w:rFonts w:ascii="Calibri" w:hAnsi="Calibri"/>
+              </w:rPr>
+              <w:t>Request assistance when unable to log in or access the OneHub platform via web or mobile.</w:t>
+            </w:r>
+          </w:p>
+        </w:tc>
+        <w:tc>
+          <w:p>
+            <w:r>
+              <w:rPr>
+                <w:sz w:val="16"/>
+                <w:rFonts w:ascii="Calibri" w:hAnsi="Calibri"/>
+              </w:rPr>
+              <w:t>Valid government credentials (Microsoft account); MFA device registered</w:t>
+            </w:r>
+          </w:p>
+        </w:tc>
       </w:tr>
       <w:tr>
         <w:tc>
@@ -6548,6 +6636,28 @@
             </w:r>
           </w:p>
         </w:tc>
+        <w:tc>
+          <w:p>
+            <w:r>
+              <w:rPr>
+                <w:sz w:val="16"/>
+                <w:rFonts w:ascii="Calibri" w:hAnsi="Calibri"/>
+              </w:rPr>
+              <w:t>Reset multi-factor authentication or migrate MFA to a new device when the user cannot complete verification.</w:t>
+            </w:r>
+          </w:p>
+        </w:tc>
+        <w:tc>
+          <w:p>
+            <w:r>
+              <w:rPr>
+                <w:sz w:val="16"/>
+                <w:rFonts w:ascii="Calibri" w:hAnsi="Calibri"/>
+              </w:rPr>
+              <w:t>Employee ID; proof of identity; details of new device (if applicable)</w:t>
+            </w:r>
+          </w:p>
+        </w:tc>
       </w:tr>
       <w:tr>
         <w:tc>
@@ -6640,6 +6750,28 @@
             </w:r>
           </w:p>
         </w:tc>
+        <w:tc>
+          <w:p>
+            <w:r>
+              <w:rPr>
+                <w:sz w:val="16"/>
+                <w:rFonts w:ascii="Calibri" w:hAnsi="Calibri"/>
+              </w:rPr>
+              <w:t>Resolve cases where a user's account is incorrectly mapped to the wrong entity, role, or person.</w:t>
+            </w:r>
+          </w:p>
+        </w:tc>
+        <w:tc>
+          <w:p>
+            <w:r>
+              <w:rPr>
+                <w:sz w:val="16"/>
+                <w:rFonts w:ascii="Calibri" w:hAnsi="Calibri"/>
+              </w:rPr>
+              <w:t>Employee ID; correct entity/department details; screenshot of the incorrect mapping</w:t>
+            </w:r>
+          </w:p>
+        </w:tc>
       </w:tr>
       <w:tr>
         <w:tc>
@@ -6738,6 +6870,28 @@
             </w:r>
           </w:p>
         </w:tc>
+        <w:tc>
+          <w:p>
+            <w:r>
+              <w:rPr>
+                <w:sz w:val="16"/>
+                <w:rFonts w:ascii="Calibri" w:hAnsi="Calibri"/>
+              </w:rPr>
+              <w:t>Activate a new OneHub account for a newly onboarded employee or transferred user.</w:t>
+            </w:r>
+          </w:p>
+        </w:tc>
+        <w:tc>
+          <w:p>
+            <w:r>
+              <w:rPr>
+                <w:sz w:val="16"/>
+                <w:rFonts w:ascii="Calibri" w:hAnsi="Calibri"/>
+              </w:rPr>
+              <w:t>Employee ID; approved onboarding/transfer form; entity name; email address</w:t>
+            </w:r>
+          </w:p>
+        </w:tc>
       </w:tr>
       <w:tr>
         <w:tc>
@@ -6830,6 +6984,28 @@
             </w:r>
           </w:p>
         </w:tc>
+        <w:tc>
+          <w:p>
+            <w:r>
+              <w:rPr>
+                <w:sz w:val="16"/>
+                <w:rFonts w:ascii="Calibri" w:hAnsi="Calibri"/>
+              </w:rPr>
+              <w:t>Query or dispute an attendance violation recorded in the Time &amp; Attendance system.</w:t>
+            </w:r>
+          </w:p>
+        </w:tc>
+        <w:tc>
+          <w:p>
+            <w:r>
+              <w:rPr>
+                <w:sz w:val="16"/>
+                <w:rFonts w:ascii="Calibri" w:hAnsi="Calibri"/>
+              </w:rPr>
+              <w:t>Employee ID; violation date(s); screenshot or reference number of the violation</w:t>
+            </w:r>
+          </w:p>
+        </w:tc>
       </w:tr>
       <w:tr>
         <w:tc>
@@ -6928,6 +7104,28 @@
             </w:r>
           </w:p>
         </w:tc>
+        <w:tc>
+          <w:p>
+            <w:r>
+              <w:rPr>
+                <w:sz w:val="16"/>
+                <w:rFonts w:ascii="Calibri" w:hAnsi="Calibri"/>
+              </w:rPr>
+              <w:t>Regularize a missing check-in or check-out swipe to correct attendance records.</w:t>
+            </w:r>
+          </w:p>
+        </w:tc>
+        <w:tc>
+          <w:p>
+            <w:r>
+              <w:rPr>
+                <w:sz w:val="16"/>
+                <w:rFonts w:ascii="Calibri" w:hAnsi="Calibri"/>
+              </w:rPr>
+              <w:t>Employee ID; date and expected swipe time; manager approval (if required by policy)</w:t>
+            </w:r>
+          </w:p>
+        </w:tc>
       </w:tr>
       <w:tr>
         <w:tc>
@@ -7020,6 +7218,28 @@
             </w:r>
           </w:p>
         </w:tc>
+        <w:tc>
+          <w:p>
+            <w:r>
+              <w:rPr>
+                <w:sz w:val="16"/>
+                <w:rFonts w:ascii="Calibri" w:hAnsi="Calibri"/>
+              </w:rPr>
+              <w:t>Request support for check-in functionality or the Drive Safely geolocation-based attendance feature.</w:t>
+            </w:r>
+          </w:p>
+        </w:tc>
+        <w:tc>
+          <w:p>
+            <w:r>
+              <w:rPr>
+                <w:sz w:val="16"/>
+                <w:rFonts w:ascii="Calibri" w:hAnsi="Calibri"/>
+              </w:rPr>
+              <w:t>Employee ID; device type and OS version; location/GPS status at time of check-in attempt</w:t>
+            </w:r>
+          </w:p>
+        </w:tc>
       </w:tr>
       <w:tr>
         <w:tc>
@@ -7118,6 +7338,28 @@
             </w:r>
           </w:p>
         </w:tc>
+        <w:tc>
+          <w:p>
+            <w:r>
+              <w:rPr>
+                <w:sz w:val="16"/>
+                <w:rFonts w:ascii="Calibri" w:hAnsi="Calibri"/>
+              </w:rPr>
+              <w:t>Request a detailed Time &amp; Attendance report for a specific period.</w:t>
+            </w:r>
+          </w:p>
+        </w:tc>
+        <w:tc>
+          <w:p>
+            <w:r>
+              <w:rPr>
+                <w:sz w:val="16"/>
+                <w:rFonts w:ascii="Calibri" w:hAnsi="Calibri"/>
+              </w:rPr>
+              <w:t>Employee ID; date range for the report; report format preference (PDF/Excel)</w:t>
+            </w:r>
+          </w:p>
+        </w:tc>
       </w:tr>
       <w:tr>
         <w:tc>
@@ -7210,6 +7452,28 @@
             </w:r>
           </w:p>
         </w:tc>
+        <w:tc>
+          <w:p>
+            <w:r>
+              <w:rPr>
+                <w:sz w:val="16"/>
+                <w:rFonts w:ascii="Calibri" w:hAnsi="Calibri"/>
+              </w:rPr>
+              <w:t>Assistance with submitting, modifying, or cancelling a leave request (annual, sick, or other types).</w:t>
+            </w:r>
+          </w:p>
+        </w:tc>
+        <w:tc>
+          <w:p>
+            <w:r>
+              <w:rPr>
+                <w:sz w:val="16"/>
+                <w:rFonts w:ascii="Calibri" w:hAnsi="Calibri"/>
+              </w:rPr>
+              <w:t>Employee ID; leave type; requested dates; supporting documents (e.g., medical certificate for sick leave)</w:t>
+            </w:r>
+          </w:p>
+        </w:tc>
       </w:tr>
       <w:tr>
         <w:tc>
@@ -7308,6 +7572,28 @@
             </w:r>
           </w:p>
         </w:tc>
+        <w:tc>
+          <w:p>
+            <w:r>
+              <w:rPr>
+                <w:sz w:val="16"/>
+                <w:rFonts w:ascii="Calibri" w:hAnsi="Calibri"/>
+              </w:rPr>
+              <w:t>Request remote work permission or resolve issues with remote check-in functionality.</w:t>
+            </w:r>
+          </w:p>
+        </w:tc>
+        <w:tc>
+          <w:p>
+            <w:r>
+              <w:rPr>
+                <w:sz w:val="16"/>
+                <w:rFonts w:ascii="Calibri" w:hAnsi="Calibri"/>
+              </w:rPr>
+              <w:t>Employee ID; requested remote work dates; manager approval; remote work justification</w:t>
+            </w:r>
+          </w:p>
+        </w:tc>
       </w:tr>
       <w:tr>
         <w:tc>
@@ -7400,6 +7686,28 @@
             </w:r>
           </w:p>
         </w:tc>
+        <w:tc>
+          <w:p>
+            <w:r>
+              <w:rPr>
+                <w:sz w:val="16"/>
+                <w:rFonts w:ascii="Calibri" w:hAnsi="Calibri"/>
+              </w:rPr>
+              <w:t>Resolve stuck or failed approval workflows for leave, permissions, or other requests.</w:t>
+            </w:r>
+          </w:p>
+        </w:tc>
+        <w:tc>
+          <w:p>
+            <w:r>
+              <w:rPr>
+                <w:sz w:val="16"/>
+                <w:rFonts w:ascii="Calibri" w:hAnsi="Calibri"/>
+              </w:rPr>
+              <w:t>Request/approval reference number; name of approver; screenshot of the pending status</w:t>
+            </w:r>
+          </w:p>
+        </w:tc>
       </w:tr>
       <w:tr>
         <w:tc>
@@ -7498,6 +7806,28 @@
             </w:r>
           </w:p>
         </w:tc>
+        <w:tc>
+          <w:p>
+            <w:r>
+              <w:rPr>
+                <w:sz w:val="16"/>
+                <w:rFonts w:ascii="Calibri" w:hAnsi="Calibri"/>
+              </w:rPr>
+              <w:t>Generate salary certificates, employment letters, or 'To Whom It May Concern' documents.</w:t>
+            </w:r>
+          </w:p>
+        </w:tc>
+        <w:tc>
+          <w:p>
+            <w:r>
+              <w:rPr>
+                <w:sz w:val="16"/>
+                <w:rFonts w:ascii="Calibri" w:hAnsi="Calibri"/>
+              </w:rPr>
+              <w:t>Employee ID; certificate type (salary/employment/TWIMC); language preference (EN/AR)</w:t>
+            </w:r>
+          </w:p>
+        </w:tc>
       </w:tr>
       <w:tr>
         <w:tc>
@@ -7590,6 +7920,28 @@
             </w:r>
           </w:p>
         </w:tc>
+        <w:tc>
+          <w:p>
+            <w:r>
+              <w:rPr>
+                <w:sz w:val="16"/>
+                <w:rFonts w:ascii="Calibri" w:hAnsi="Calibri"/>
+              </w:rPr>
+              <w:t>View or request a copy of the employee contract, or resolve contract display errors.</w:t>
+            </w:r>
+          </w:p>
+        </w:tc>
+        <w:tc>
+          <w:p>
+            <w:r>
+              <w:rPr>
+                <w:sz w:val="16"/>
+                <w:rFonts w:ascii="Calibri" w:hAnsi="Calibri"/>
+              </w:rPr>
+              <w:t>Employee ID; contract type or reference (if known)</w:t>
+            </w:r>
+          </w:p>
+        </w:tc>
       </w:tr>
       <w:tr>
         <w:tc>
@@ -7688,6 +8040,28 @@
             </w:r>
           </w:p>
         </w:tc>
+        <w:tc>
+          <w:p>
+            <w:r>
+              <w:rPr>
+                <w:sz w:val="16"/>
+                <w:rFonts w:ascii="Calibri" w:hAnsi="Calibri"/>
+              </w:rPr>
+              <w:t>Update personal profile information such as phone, address, family details, or official documents.</w:t>
+            </w:r>
+          </w:p>
+        </w:tc>
+        <w:tc>
+          <w:p>
+            <w:r>
+              <w:rPr>
+                <w:sz w:val="16"/>
+                <w:rFonts w:ascii="Calibri" w:hAnsi="Calibri"/>
+              </w:rPr>
+              <w:t>Employee ID; field(s) to update; supporting documents (e.g., updated Emirates ID, passport)</w:t>
+            </w:r>
+          </w:p>
+        </w:tc>
       </w:tr>
       <w:tr>
         <w:tc>
@@ -7780,6 +8154,28 @@
             </w:r>
           </w:p>
         </w:tc>
+        <w:tc>
+          <w:p>
+            <w:r>
+              <w:rPr>
+                <w:sz w:val="16"/>
+                <w:rFonts w:ascii="Calibri" w:hAnsi="Calibri"/>
+              </w:rPr>
+              <w:t>Set up or modify delegation of approvals and responsibilities to another employee.</w:t>
+            </w:r>
+          </w:p>
+        </w:tc>
+        <w:tc>
+          <w:p>
+            <w:r>
+              <w:rPr>
+                <w:sz w:val="16"/>
+                <w:rFonts w:ascii="Calibri" w:hAnsi="Calibri"/>
+              </w:rPr>
+              <w:t>Employee ID; delegate's Employee ID; delegation period (start/end dates); scope of delegation</w:t>
+            </w:r>
+          </w:p>
+        </w:tc>
       </w:tr>
       <w:tr>
         <w:tc>
@@ -7878,6 +8274,28 @@
             </w:r>
           </w:p>
         </w:tc>
+        <w:tc>
+          <w:p>
+            <w:r>
+              <w:rPr>
+                <w:sz w:val="16"/>
+                <w:rFonts w:ascii="Calibri" w:hAnsi="Calibri"/>
+              </w:rPr>
+              <w:t>View or download pay slips, or resolve issues accessing pay slip information.</w:t>
+            </w:r>
+          </w:p>
+        </w:tc>
+        <w:tc>
+          <w:p>
+            <w:r>
+              <w:rPr>
+                <w:sz w:val="16"/>
+                <w:rFonts w:ascii="Calibri" w:hAnsi="Calibri"/>
+              </w:rPr>
+              <w:t>Employee ID; pay period (month/year)</w:t>
+            </w:r>
+          </w:p>
+        </w:tc>
       </w:tr>
       <w:tr>
         <w:tc>
@@ -7970,6 +8388,28 @@
             </w:r>
           </w:p>
         </w:tc>
+        <w:tc>
+          <w:p>
+            <w:r>
+              <w:rPr>
+                <w:sz w:val="16"/>
+                <w:rFonts w:ascii="Calibri" w:hAnsi="Calibri"/>
+              </w:rPr>
+              <w:t>Request support with performance ratings, objectives, or appraisal processes.</w:t>
+            </w:r>
+          </w:p>
+        </w:tc>
+        <w:tc>
+          <w:p>
+            <w:r>
+              <w:rPr>
+                <w:sz w:val="16"/>
+                <w:rFonts w:ascii="Calibri" w:hAnsi="Calibri"/>
+              </w:rPr>
+              <w:t>Employee ID; appraisal cycle/period; specific concern or objective reference</w:t>
+            </w:r>
+          </w:p>
+        </w:tc>
       </w:tr>
       <w:tr>
         <w:tc>
@@ -8067,6 +8507,28 @@
             </w:r>
           </w:p>
         </w:tc>
+        <w:tc>
+          <w:p>
+            <w:r>
+              <w:rPr>
+                <w:sz w:val="16"/>
+                <w:rFonts w:ascii="Calibri" w:hAnsi="Calibri"/>
+              </w:rPr>
+              <w:t>Request activation of a new e-service within the OneHub platform catalog.</w:t>
+            </w:r>
+          </w:p>
+        </w:tc>
+        <w:tc>
+          <w:p>
+            <w:r>
+              <w:rPr>
+                <w:sz w:val="16"/>
+                <w:rFonts w:ascii="Calibri" w:hAnsi="Calibri"/>
+              </w:rPr>
+              <w:t>Service name and description; business justification; entity sponsor approval</w:t>
+            </w:r>
+          </w:p>
+        </w:tc>
       </w:tr>
       <w:tr>
         <w:tc>
@@ -8159,6 +8621,28 @@
             </w:r>
           </w:p>
         </w:tc>
+        <w:tc>
+          <w:p>
+            <w:r>
+              <w:rPr>
+                <w:sz w:val="16"/>
+                <w:rFonts w:ascii="Calibri" w:hAnsi="Calibri"/>
+              </w:rPr>
+              <w:t>Enable an existing featured application (e.g., ADERP, CMS) for an entity on OneHub.</w:t>
+            </w:r>
+          </w:p>
+        </w:tc>
+        <w:tc>
+          <w:p>
+            <w:r>
+              <w:rPr>
+                <w:sz w:val="16"/>
+                <w:rFonts w:ascii="Calibri" w:hAnsi="Calibri"/>
+              </w:rPr>
+              <w:t>Application name; entity name; authorized request from entity IT admin</w:t>
+            </w:r>
+          </w:p>
+        </w:tc>
       </w:tr>
       <w:tr>
         <w:tc>
@@ -8257,6 +8741,28 @@
             </w:r>
           </w:p>
         </w:tc>
+        <w:tc>
+          <w:p>
+            <w:r>
+              <w:rPr>
+                <w:sz w:val="16"/>
+                <w:rFonts w:ascii="Calibri" w:hAnsi="Calibri"/>
+              </w:rPr>
+              <w:t>Disable a previously activated featured application for an entity on OneHub.</w:t>
+            </w:r>
+          </w:p>
+        </w:tc>
+        <w:tc>
+          <w:p>
+            <w:r>
+              <w:rPr>
+                <w:sz w:val="16"/>
+                <w:rFonts w:ascii="Calibri" w:hAnsi="Calibri"/>
+              </w:rPr>
+              <w:t>Application name; entity name; authorized request from entity IT admin; reason for deactivation</w:t>
+            </w:r>
+          </w:p>
+        </w:tc>
       </w:tr>
       <w:tr>
         <w:tc>
@@ -8349,6 +8855,28 @@
             </w:r>
           </w:p>
         </w:tc>
+        <w:tc>
+          <w:p>
+            <w:r>
+              <w:rPr>
+                <w:sz w:val="16"/>
+                <w:rFonts w:ascii="Calibri" w:hAnsi="Calibri"/>
+              </w:rPr>
+              <w:t>Add a new third-party or government application to the OneHub featured applications list.</w:t>
+            </w:r>
+          </w:p>
+        </w:tc>
+        <w:tc>
+          <w:p>
+            <w:r>
+              <w:rPr>
+                <w:sz w:val="16"/>
+                <w:rFonts w:ascii="Calibri" w:hAnsi="Calibri"/>
+              </w:rPr>
+              <w:t>Application name, URL, and logo; integration requirements; entity sponsor approval; security review</w:t>
+            </w:r>
+          </w:p>
+        </w:tc>
       </w:tr>
       <w:tr>
         <w:tc>
@@ -8447,6 +8975,28 @@
             </w:r>
           </w:p>
         </w:tc>
+        <w:tc>
+          <w:p>
+            <w:r>
+              <w:rPr>
+                <w:sz w:val="16"/>
+                <w:rFonts w:ascii="Calibri" w:hAnsi="Calibri"/>
+              </w:rPr>
+              <w:t>Hide the organization chart for a specific entity or department from OneHub users.</w:t>
+            </w:r>
+          </w:p>
+        </w:tc>
+        <w:tc>
+          <w:p>
+            <w:r>
+              <w:rPr>
+                <w:sz w:val="16"/>
+                <w:rFonts w:ascii="Calibri" w:hAnsi="Calibri"/>
+              </w:rPr>
+              <w:t>Entity/department name; authorized request from entity HR or IT admin</w:t>
+            </w:r>
+          </w:p>
+        </w:tc>
       </w:tr>
       <w:tr>
         <w:tc>
@@ -8539,6 +9089,28 @@
             </w:r>
           </w:p>
         </w:tc>
+        <w:tc>
+          <w:p>
+            <w:r>
+              <w:rPr>
+                <w:sz w:val="16"/>
+                <w:rFonts w:ascii="Calibri" w:hAnsi="Calibri"/>
+              </w:rPr>
+              <w:t>Restore visibility of a previously hidden organization chart on OneHub.</w:t>
+            </w:r>
+          </w:p>
+        </w:tc>
+        <w:tc>
+          <w:p>
+            <w:r>
+              <w:rPr>
+                <w:sz w:val="16"/>
+                <w:rFonts w:ascii="Calibri" w:hAnsi="Calibri"/>
+              </w:rPr>
+              <w:t>Entity/department name; authorized request from entity HR or IT admin</w:t>
+            </w:r>
+          </w:p>
+        </w:tc>
       </w:tr>
       <w:tr>
         <w:tc>
@@ -8637,6 +9209,28 @@
             </w:r>
           </w:p>
         </w:tc>
+        <w:tc>
+          <w:p>
+            <w:r>
+              <w:rPr>
+                <w:sz w:val="16"/>
+                <w:rFonts w:ascii="Calibri" w:hAnsi="Calibri"/>
+              </w:rPr>
+              <w:t>Register a new application or modify configuration settings for an existing integrated app.</w:t>
+            </w:r>
+          </w:p>
+        </w:tc>
+        <w:tc>
+          <w:p>
+            <w:r>
+              <w:rPr>
+                <w:sz w:val="16"/>
+                <w:rFonts w:ascii="Calibri" w:hAnsi="Calibri"/>
+              </w:rPr>
+              <w:t>Application details; configuration parameters to change; environment (prod/staging); change approval</w:t>
+            </w:r>
+          </w:p>
+        </w:tc>
       </w:tr>
       <w:tr>
         <w:tc>
@@ -8729,6 +9323,28 @@
             </w:r>
           </w:p>
         </w:tc>
+        <w:tc>
+          <w:p>
+            <w:r>
+              <w:rPr>
+                <w:sz w:val="16"/>
+                <w:rFonts w:ascii="Calibri" w:hAnsi="Calibri"/>
+              </w:rPr>
+              <w:t>Request support for data synchronization issues between OneHub and ADERP/Oracle Fusion.</w:t>
+            </w:r>
+          </w:p>
+        </w:tc>
+        <w:tc>
+          <w:p>
+            <w:r>
+              <w:rPr>
+                <w:sz w:val="16"/>
+                <w:rFonts w:ascii="Calibri" w:hAnsi="Calibri"/>
+              </w:rPr>
+              <w:t>Employee ID; affected module (HR, Finance, etc.); error message or screenshot; date of occurrence</w:t>
+            </w:r>
+          </w:p>
+        </w:tc>
       </w:tr>
       <w:tr>
         <w:tc>
@@ -8827,6 +9443,28 @@
             </w:r>
           </w:p>
         </w:tc>
+        <w:tc>
+          <w:p>
+            <w:r>
+              <w:rPr>
+                <w:sz w:val="16"/>
+                <w:rFonts w:ascii="Calibri" w:hAnsi="Calibri"/>
+              </w:rPr>
+              <w:t>Resolve delays or failures in notification delivery or approval synchronization across systems.</w:t>
+            </w:r>
+          </w:p>
+        </w:tc>
+        <w:tc>
+          <w:p>
+            <w:r>
+              <w:rPr>
+                <w:sz w:val="16"/>
+                <w:rFonts w:ascii="Calibri" w:hAnsi="Calibri"/>
+              </w:rPr>
+              <w:t>Request/notification reference number; source system; expected vs. actual behavior</w:t>
+            </w:r>
+          </w:p>
+        </w:tc>
       </w:tr>
       <w:tr>
         <w:tc>
@@ -8919,6 +9557,28 @@
             </w:r>
           </w:p>
         </w:tc>
+        <w:tc>
+          <w:p>
+            <w:r>
+              <w:rPr>
+                <w:sz w:val="16"/>
+                <w:rFonts w:ascii="Calibri" w:hAnsi="Calibri"/>
+              </w:rPr>
+              <w:t>Request support for Correspondence Management System (CMS) integration within OneHub.</w:t>
+            </w:r>
+          </w:p>
+        </w:tc>
+        <w:tc>
+          <w:p>
+            <w:r>
+              <w:rPr>
+                <w:sz w:val="16"/>
+                <w:rFonts w:ascii="Calibri" w:hAnsi="Calibri"/>
+              </w:rPr>
+              <w:t>Correspondence reference number; entity/department; action required (sign, approve, etc.)</w:t>
+            </w:r>
+          </w:p>
+        </w:tc>
       </w:tr>
       <w:tr>
         <w:tc>
@@ -9017,6 +9677,28 @@
             </w:r>
           </w:p>
         </w:tc>
+        <w:tc>
+          <w:p>
+            <w:r>
+              <w:rPr>
+                <w:sz w:val="16"/>
+                <w:rFonts w:ascii="Calibri" w:hAnsi="Calibri"/>
+              </w:rPr>
+              <w:t>Request changes to API endpoints, system configurations, or integration settings.</w:t>
+            </w:r>
+          </w:p>
+        </w:tc>
+        <w:tc>
+          <w:p>
+            <w:r>
+              <w:rPr>
+                <w:sz w:val="16"/>
+                <w:rFonts w:ascii="Calibri" w:hAnsi="Calibri"/>
+              </w:rPr>
+              <w:t>API endpoint details; change description; environment (prod/staging); technical approval</w:t>
+            </w:r>
+          </w:p>
+        </w:tc>
       </w:tr>
       <w:tr>
         <w:tc>
@@ -9109,6 +9791,28 @@
             </w:r>
           </w:p>
         </w:tc>
+        <w:tc>
+          <w:p>
+            <w:r>
+              <w:rPr>
+                <w:sz w:val="16"/>
+                <w:rFonts w:ascii="Calibri" w:hAnsi="Calibri"/>
+              </w:rPr>
+              <w:t>Resolve issues with the OneHub mobile application (crashes, loading failures, installation problems).</w:t>
+            </w:r>
+          </w:p>
+        </w:tc>
+        <w:tc>
+          <w:p>
+            <w:r>
+              <w:rPr>
+                <w:sz w:val="16"/>
+                <w:rFonts w:ascii="Calibri" w:hAnsi="Calibri"/>
+              </w:rPr>
+              <w:t>Device model and OS version; app version; screenshot or error description</w:t>
+            </w:r>
+          </w:p>
+        </w:tc>
       </w:tr>
       <w:tr>
         <w:tc>
@@ -9207,6 +9911,28 @@
             </w:r>
           </w:p>
         </w:tc>
+        <w:tc>
+          <w:p>
+            <w:r>
+              <w:rPr>
+                <w:sz w:val="16"/>
+                <w:rFonts w:ascii="Calibri" w:hAnsi="Calibri"/>
+              </w:rPr>
+              <w:t>Resolve login failures specific to the OneHub mobile application.</w:t>
+            </w:r>
+          </w:p>
+        </w:tc>
+        <w:tc>
+          <w:p>
+            <w:r>
+              <w:rPr>
+                <w:sz w:val="16"/>
+                <w:rFonts w:ascii="Calibri" w:hAnsi="Calibri"/>
+              </w:rPr>
+              <w:t>Employee ID; device model and OS version; app version; error message</w:t>
+            </w:r>
+          </w:p>
+        </w:tc>
       </w:tr>
       <w:tr>
         <w:tc>
@@ -9299,6 +10025,28 @@
             </w:r>
           </w:p>
         </w:tc>
+        <w:tc>
+          <w:p>
+            <w:r>
+              <w:rPr>
+                <w:sz w:val="16"/>
+                <w:rFonts w:ascii="Calibri" w:hAnsi="Calibri"/>
+              </w:rPr>
+              <w:t>Submit a general service request that does not fit into a specific category.</w:t>
+            </w:r>
+          </w:p>
+        </w:tc>
+        <w:tc>
+          <w:p>
+            <w:r>
+              <w:rPr>
+                <w:sz w:val="16"/>
+                <w:rFonts w:ascii="Calibri" w:hAnsi="Calibri"/>
+              </w:rPr>
+              <w:t>Employee ID; detailed description of the request</w:t>
+            </w:r>
+          </w:p>
+        </w:tc>
       </w:tr>
       <w:tr>
         <w:tc>
@@ -9394,6 +10142,28 @@
                 <w:sz w:val="18"/>
               </w:rPr>
               <w:t>DGE HQ IT CDP OneHub Support</w:t>
+            </w:r>
+          </w:p>
+        </w:tc>
+        <w:tc>
+          <w:p>
+            <w:r>
+              <w:rPr>
+                <w:sz w:val="16"/>
+                <w:rFonts w:ascii="Calibri" w:hAnsi="Calibri"/>
+              </w:rPr>
+              <w:t>Request a new service or feature that is not currently available in the OneHub catalog.</w:t>
+            </w:r>
+          </w:p>
+        </w:tc>
+        <w:tc>
+          <w:p>
+            <w:r>
+              <w:rPr>
+                <w:sz w:val="16"/>
+                <w:rFonts w:ascii="Calibri" w:hAnsi="Calibri"/>
+              </w:rPr>
+              <w:t>Service/feature description; business justification; expected user base; entity sponsor</w:t>
             </w:r>
           </w:p>
         </w:tc>

</xml_diff>